<commit_message>
Seite 26 - 30 angepasst
</commit_message>
<xml_diff>
--- a/Doc/Arbeitsblaetter_2025.docx
+++ b/Doc/Arbeitsblaetter_2025.docx
@@ -30913,14 +30913,11 @@
         <w:spacing w:before="120"/>
       </w:pPr>
       <w:r>
-        <w:rPr>
-          <w:noProof/>
-        </w:rPr>
         <w:drawing>
-          <wp:inline distT="0" distB="0" distL="0" distR="0" wp14:anchorId="7B663147" wp14:editId="2A460BCA">
-            <wp:extent cx="5965371" cy="664592"/>
-            <wp:effectExtent l="0" t="0" r="0" b="2540"/>
-            <wp:docPr id="921426628" name="Grafik 1"/>
+          <wp:inline distT="0" distB="0" distL="0" distR="0" wp14:anchorId="2CD4795B" wp14:editId="1C711414">
+            <wp:extent cx="5420979" cy="792480"/>
+            <wp:effectExtent l="0" t="0" r="8890" b="7620"/>
+            <wp:docPr id="544097703" name="Grafik 1"/>
             <wp:cNvGraphicFramePr>
               <a:graphicFrameLocks xmlns:a="http://schemas.openxmlformats.org/drawingml/2006/main" noChangeAspect="1"/>
             </wp:cNvGraphicFramePr>
@@ -30928,7 +30925,7 @@
               <a:graphicData uri="http://schemas.openxmlformats.org/drawingml/2006/picture">
                 <pic:pic xmlns:pic="http://schemas.openxmlformats.org/drawingml/2006/picture">
                   <pic:nvPicPr>
-                    <pic:cNvPr id="921426628" name=""/>
+                    <pic:cNvPr id="544097703" name=""/>
                     <pic:cNvPicPr/>
                   </pic:nvPicPr>
                   <pic:blipFill>
@@ -30940,7 +30937,7 @@
                   <pic:spPr>
                     <a:xfrm>
                       <a:off x="0" y="0"/>
-                      <a:ext cx="5984725" cy="666748"/>
+                      <a:ext cx="5541478" cy="810095"/>
                     </a:xfrm>
                     <a:prstGeom prst="rect">
                       <a:avLst/>
@@ -30955,17 +30952,14 @@
     </w:p>
     <w:p>
       <w:pPr>
-        <w:spacing w:before="60"/>
-      </w:pPr>
-      <w:r>
-        <w:rPr>
-          <w:noProof/>
-        </w:rPr>
+        <w:spacing w:before="120"/>
+      </w:pPr>
+      <w:r>
         <w:drawing>
-          <wp:inline distT="0" distB="0" distL="0" distR="0" wp14:anchorId="24E3BF60" wp14:editId="6C94906D">
-            <wp:extent cx="6645910" cy="3267075"/>
-            <wp:effectExtent l="0" t="0" r="2540" b="9525"/>
-            <wp:docPr id="2019495262" name="Grafik 1"/>
+          <wp:inline distT="0" distB="0" distL="0" distR="0" wp14:anchorId="64FC5A7D" wp14:editId="400EF43A">
+            <wp:extent cx="6048444" cy="3124200"/>
+            <wp:effectExtent l="0" t="0" r="9525" b="0"/>
+            <wp:docPr id="165043731" name="Grafik 1"/>
             <wp:cNvGraphicFramePr>
               <a:graphicFrameLocks xmlns:a="http://schemas.openxmlformats.org/drawingml/2006/main" noChangeAspect="1"/>
             </wp:cNvGraphicFramePr>
@@ -30973,7 +30967,7 @@
               <a:graphicData uri="http://schemas.openxmlformats.org/drawingml/2006/picture">
                 <pic:pic xmlns:pic="http://schemas.openxmlformats.org/drawingml/2006/picture">
                   <pic:nvPicPr>
-                    <pic:cNvPr id="2019495262" name=""/>
+                    <pic:cNvPr id="165043731" name=""/>
                     <pic:cNvPicPr/>
                   </pic:nvPicPr>
                   <pic:blipFill>
@@ -30985,7 +30979,7 @@
                   <pic:spPr>
                     <a:xfrm>
                       <a:off x="0" y="0"/>
-                      <a:ext cx="6645910" cy="3267075"/>
+                      <a:ext cx="6085005" cy="3143085"/>
                     </a:xfrm>
                     <a:prstGeom prst="rect">
                       <a:avLst/>
@@ -30999,16 +30993,17 @@
       </w:r>
     </w:p>
     <w:p>
-      <w:r>
-        <w:rPr>
-          <w:noProof/>
-        </w:rPr>
-        <w:lastRenderedPageBreak/>
+      <w:pPr>
+        <w:spacing w:before="60"/>
+      </w:pPr>
+    </w:p>
+    <w:p>
+      <w:r>
         <w:drawing>
-          <wp:inline distT="0" distB="0" distL="0" distR="0" wp14:anchorId="35DC1C57" wp14:editId="6A6B93EC">
-            <wp:extent cx="6645910" cy="7693025"/>
-            <wp:effectExtent l="0" t="0" r="2540" b="3175"/>
-            <wp:docPr id="1088312767" name="Grafik 1"/>
+          <wp:inline distT="0" distB="0" distL="0" distR="0" wp14:anchorId="22DD3D33" wp14:editId="3F0871B3">
+            <wp:extent cx="6645910" cy="7910830"/>
+            <wp:effectExtent l="0" t="0" r="2540" b="0"/>
+            <wp:docPr id="1929972887" name="Grafik 1"/>
             <wp:cNvGraphicFramePr>
               <a:graphicFrameLocks xmlns:a="http://schemas.openxmlformats.org/drawingml/2006/main" noChangeAspect="1"/>
             </wp:cNvGraphicFramePr>
@@ -31016,7 +31011,7 @@
               <a:graphicData uri="http://schemas.openxmlformats.org/drawingml/2006/picture">
                 <pic:pic xmlns:pic="http://schemas.openxmlformats.org/drawingml/2006/picture">
                   <pic:nvPicPr>
-                    <pic:cNvPr id="1088312767" name=""/>
+                    <pic:cNvPr id="1929972887" name=""/>
                     <pic:cNvPicPr/>
                   </pic:nvPicPr>
                   <pic:blipFill>
@@ -31028,7 +31023,7 @@
                   <pic:spPr>
                     <a:xfrm>
                       <a:off x="0" y="0"/>
-                      <a:ext cx="6645910" cy="7693025"/>
+                      <a:ext cx="6645910" cy="7910830"/>
                     </a:xfrm>
                     <a:prstGeom prst="rect">
                       <a:avLst/>
@@ -31367,10 +31362,10 @@
       </w:pPr>
       <w:r>
         <w:drawing>
-          <wp:inline distT="0" distB="0" distL="0" distR="0" wp14:anchorId="28BB0DE3" wp14:editId="194F1027">
-            <wp:extent cx="6008294" cy="6067425"/>
-            <wp:effectExtent l="0" t="0" r="0" b="0"/>
-            <wp:docPr id="781243302" name="Grafik 1"/>
+          <wp:inline distT="0" distB="0" distL="0" distR="0" wp14:anchorId="2473D360" wp14:editId="0A3CB3B3">
+            <wp:extent cx="6057900" cy="6015067"/>
+            <wp:effectExtent l="0" t="0" r="0" b="5080"/>
+            <wp:docPr id="1873441171" name="Grafik 1"/>
             <wp:cNvGraphicFramePr>
               <a:graphicFrameLocks xmlns:a="http://schemas.openxmlformats.org/drawingml/2006/main" noChangeAspect="1"/>
             </wp:cNvGraphicFramePr>
@@ -31378,7 +31373,7 @@
               <a:graphicData uri="http://schemas.openxmlformats.org/drawingml/2006/picture">
                 <pic:pic xmlns:pic="http://schemas.openxmlformats.org/drawingml/2006/picture">
                   <pic:nvPicPr>
-                    <pic:cNvPr id="781243302" name=""/>
+                    <pic:cNvPr id="1873441171" name=""/>
                     <pic:cNvPicPr/>
                   </pic:nvPicPr>
                   <pic:blipFill>
@@ -31390,7 +31385,7 @@
                   <pic:spPr>
                     <a:xfrm>
                       <a:off x="0" y="0"/>
-                      <a:ext cx="6020563" cy="6079815"/>
+                      <a:ext cx="6066951" cy="6024054"/>
                     </a:xfrm>
                     <a:prstGeom prst="rect">
                       <a:avLst/>
@@ -31624,10 +31619,10 @@
       </w:pPr>
       <w:r>
         <w:drawing>
-          <wp:inline distT="0" distB="0" distL="0" distR="0" wp14:anchorId="50BBBBBB" wp14:editId="09000D3A">
-            <wp:extent cx="6645910" cy="1804035"/>
-            <wp:effectExtent l="0" t="0" r="2540" b="5715"/>
-            <wp:docPr id="963806501" name="Grafik 1"/>
+          <wp:inline distT="0" distB="0" distL="0" distR="0" wp14:anchorId="7F2FDFC8" wp14:editId="38888C00">
+            <wp:extent cx="6645910" cy="2047875"/>
+            <wp:effectExtent l="0" t="0" r="2540" b="9525"/>
+            <wp:docPr id="1302850884" name="Grafik 1"/>
             <wp:cNvGraphicFramePr>
               <a:graphicFrameLocks xmlns:a="http://schemas.openxmlformats.org/drawingml/2006/main" noChangeAspect="1"/>
             </wp:cNvGraphicFramePr>
@@ -31635,7 +31630,7 @@
               <a:graphicData uri="http://schemas.openxmlformats.org/drawingml/2006/picture">
                 <pic:pic xmlns:pic="http://schemas.openxmlformats.org/drawingml/2006/picture">
                   <pic:nvPicPr>
-                    <pic:cNvPr id="963806501" name=""/>
+                    <pic:cNvPr id="1302850884" name=""/>
                     <pic:cNvPicPr/>
                   </pic:nvPicPr>
                   <pic:blipFill>
@@ -31647,7 +31642,7 @@
                   <pic:spPr>
                     <a:xfrm>
                       <a:off x="0" y="0"/>
-                      <a:ext cx="6645910" cy="1804035"/>
+                      <a:ext cx="6645910" cy="2047875"/>
                     </a:xfrm>
                     <a:prstGeom prst="rect">
                       <a:avLst/>
@@ -31667,10 +31662,10 @@
       <w:r>
         <w:lastRenderedPageBreak/>
         <w:drawing>
-          <wp:inline distT="0" distB="0" distL="0" distR="0" wp14:anchorId="38416416" wp14:editId="4913A9F1">
-            <wp:extent cx="6645910" cy="6304915"/>
-            <wp:effectExtent l="0" t="0" r="2540" b="635"/>
-            <wp:docPr id="1236245634" name="Grafik 1"/>
+          <wp:inline distT="0" distB="0" distL="0" distR="0" wp14:anchorId="29EFCF09" wp14:editId="4526173B">
+            <wp:extent cx="6645910" cy="6285230"/>
+            <wp:effectExtent l="0" t="0" r="2540" b="1270"/>
+            <wp:docPr id="320176946" name="Grafik 1"/>
             <wp:cNvGraphicFramePr>
               <a:graphicFrameLocks xmlns:a="http://schemas.openxmlformats.org/drawingml/2006/main" noChangeAspect="1"/>
             </wp:cNvGraphicFramePr>
@@ -31678,7 +31673,7 @@
               <a:graphicData uri="http://schemas.openxmlformats.org/drawingml/2006/picture">
                 <pic:pic xmlns:pic="http://schemas.openxmlformats.org/drawingml/2006/picture">
                   <pic:nvPicPr>
-                    <pic:cNvPr id="1236245634" name=""/>
+                    <pic:cNvPr id="320176946" name=""/>
                     <pic:cNvPicPr/>
                   </pic:nvPicPr>
                   <pic:blipFill>
@@ -31690,7 +31685,7 @@
                   <pic:spPr>
                     <a:xfrm>
                       <a:off x="0" y="0"/>
-                      <a:ext cx="6645910" cy="6304915"/>
+                      <a:ext cx="6645910" cy="6285230"/>
                     </a:xfrm>
                     <a:prstGeom prst="rect">
                       <a:avLst/>
@@ -35237,7 +35232,7 @@
       <w:rPr>
         <w:noProof/>
       </w:rPr>
-      <w:t>28.12.2025</w:t>
+      <w:t>29.12.2025</w:t>
     </w:r>
     <w:r>
       <w:rPr>

</xml_diff>

<commit_message>
Seite 31-33: Programmcode aktualisiert
</commit_message>
<xml_diff>
--- a/Doc/Arbeitsblaetter_2025.docx
+++ b/Doc/Arbeitsblaetter_2025.docx
@@ -30913,6 +30913,9 @@
         <w:spacing w:before="120"/>
       </w:pPr>
       <w:r>
+        <w:rPr>
+          <w:noProof/>
+        </w:rPr>
         <w:drawing>
           <wp:inline distT="0" distB="0" distL="0" distR="0" wp14:anchorId="2CD4795B" wp14:editId="1C711414">
             <wp:extent cx="5420979" cy="792480"/>
@@ -30955,6 +30958,9 @@
         <w:spacing w:before="120"/>
       </w:pPr>
       <w:r>
+        <w:rPr>
+          <w:noProof/>
+        </w:rPr>
         <w:drawing>
           <wp:inline distT="0" distB="0" distL="0" distR="0" wp14:anchorId="64FC5A7D" wp14:editId="400EF43A">
             <wp:extent cx="6048444" cy="3124200"/>
@@ -30999,6 +31005,9 @@
     </w:p>
     <w:p>
       <w:r>
+        <w:rPr>
+          <w:noProof/>
+        </w:rPr>
         <w:drawing>
           <wp:inline distT="0" distB="0" distL="0" distR="0" wp14:anchorId="22DD3D33" wp14:editId="3F0871B3">
             <wp:extent cx="6645910" cy="7910830"/>
@@ -31361,6 +31370,9 @@
         <w:spacing w:before="120"/>
       </w:pPr>
       <w:r>
+        <w:rPr>
+          <w:noProof/>
+        </w:rPr>
         <w:drawing>
           <wp:inline distT="0" distB="0" distL="0" distR="0" wp14:anchorId="2473D360" wp14:editId="0A3CB3B3">
             <wp:extent cx="6057900" cy="6015067"/>
@@ -31414,15 +31426,7 @@
         <w:t xml:space="preserve"> Irrgarten</w:t>
       </w:r>
       <w:r>
-        <w:t xml:space="preserve">: </w:t>
-      </w:r>
-      <w:proofErr w:type="spellStart"/>
-      <w:r>
-        <w:t>Pledge</w:t>
-      </w:r>
-      <w:proofErr w:type="spellEnd"/>
-      <w:r>
-        <w:t>-Algorithmus</w:t>
+        <w:t>: Pledge-Algorithmus</w:t>
       </w:r>
       <w:bookmarkEnd w:id="122"/>
     </w:p>
@@ -31431,15 +31435,7 @@
         <w:pStyle w:val="berschrift3"/>
       </w:pPr>
       <w:r>
-        <w:t xml:space="preserve">Aufgabe: Mit dem </w:t>
-      </w:r>
-      <w:proofErr w:type="spellStart"/>
-      <w:r>
-        <w:t>Pledge</w:t>
-      </w:r>
-      <w:proofErr w:type="spellEnd"/>
-      <w:r>
-        <w:t xml:space="preserve">-Algorithmus findet der Roboter aus jedem Irrgarten - </w:t>
+        <w:t xml:space="preserve">Aufgabe: Mit dem Pledge-Algorithmus findet der Roboter aus jedem Irrgarten - </w:t>
       </w:r>
       <w:r>
         <w:t>turtle_in_maze_pledge_algorithm_2x1.py</w:t>
@@ -31447,15 +31443,7 @@
     </w:p>
     <w:p>
       <w:r>
-        <w:t xml:space="preserve">Der </w:t>
-      </w:r>
-      <w:proofErr w:type="spellStart"/>
-      <w:r>
-        <w:t>Pledge</w:t>
-      </w:r>
-      <w:proofErr w:type="spellEnd"/>
-      <w:r>
-        <w:t xml:space="preserve">-Algorithmus arbeitet mit dem Drehungs-Level </w:t>
+        <w:t xml:space="preserve">Der Pledge-Algorithmus arbeitet mit dem Drehungs-Level </w:t>
       </w:r>
       <w:proofErr w:type="spellStart"/>
       <w:r>
@@ -31618,6 +31606,9 @@
         <w:spacing w:before="120"/>
       </w:pPr>
       <w:r>
+        <w:rPr>
+          <w:noProof/>
+        </w:rPr>
         <w:drawing>
           <wp:inline distT="0" distB="0" distL="0" distR="0" wp14:anchorId="7F2FDFC8" wp14:editId="38888C00">
             <wp:extent cx="6645910" cy="2047875"/>
@@ -31660,6 +31651,9 @@
         <w:spacing w:before="120"/>
       </w:pPr>
       <w:r>
+        <w:rPr>
+          <w:noProof/>
+        </w:rPr>
         <w:lastRenderedPageBreak/>
         <w:drawing>
           <wp:inline distT="0" distB="0" distL="0" distR="0" wp14:anchorId="29EFCF09" wp14:editId="4526173B">
@@ -31895,14 +31889,11 @@
         <w:spacing w:before="120"/>
       </w:pPr>
       <w:r>
-        <w:rPr>
-          <w:noProof/>
-        </w:rPr>
         <w:drawing>
-          <wp:inline distT="0" distB="0" distL="0" distR="0" wp14:anchorId="42FEF422" wp14:editId="0DE3559B">
-            <wp:extent cx="4902725" cy="6210605"/>
+          <wp:inline distT="0" distB="0" distL="0" distR="0" wp14:anchorId="2F55EC40" wp14:editId="202CF06B">
+            <wp:extent cx="5125603" cy="6294120"/>
             <wp:effectExtent l="0" t="0" r="0" b="0"/>
-            <wp:docPr id="947505638" name="Grafik 1"/>
+            <wp:docPr id="543889699" name="Grafik 1"/>
             <wp:cNvGraphicFramePr>
               <a:graphicFrameLocks xmlns:a="http://schemas.openxmlformats.org/drawingml/2006/main" noChangeAspect="1"/>
             </wp:cNvGraphicFramePr>
@@ -31910,7 +31901,7 @@
               <a:graphicData uri="http://schemas.openxmlformats.org/drawingml/2006/picture">
                 <pic:pic xmlns:pic="http://schemas.openxmlformats.org/drawingml/2006/picture">
                   <pic:nvPicPr>
-                    <pic:cNvPr id="947505638" name=""/>
+                    <pic:cNvPr id="543889699" name=""/>
                     <pic:cNvPicPr/>
                   </pic:nvPicPr>
                   <pic:blipFill>
@@ -31922,7 +31913,7 @@
                   <pic:spPr>
                     <a:xfrm>
                       <a:off x="0" y="0"/>
-                      <a:ext cx="4933816" cy="6249990"/>
+                      <a:ext cx="5141758" cy="6313958"/>
                     </a:xfrm>
                     <a:prstGeom prst="rect">
                       <a:avLst/>
@@ -31937,15 +31928,12 @@
     </w:p>
     <w:p>
       <w:r>
-        <w:rPr>
-          <w:noProof/>
-        </w:rPr>
         <w:lastRenderedPageBreak/>
         <w:drawing>
-          <wp:inline distT="0" distB="0" distL="0" distR="0" wp14:anchorId="47C8AA79" wp14:editId="57047F1F">
-            <wp:extent cx="4593945" cy="2404748"/>
-            <wp:effectExtent l="0" t="0" r="0" b="0"/>
-            <wp:docPr id="1132075693" name="Grafik 1"/>
+          <wp:inline distT="0" distB="0" distL="0" distR="0" wp14:anchorId="0E5B66A1" wp14:editId="38118AE6">
+            <wp:extent cx="5002177" cy="2819400"/>
+            <wp:effectExtent l="0" t="0" r="8255" b="0"/>
+            <wp:docPr id="406532510" name="Grafik 1"/>
             <wp:cNvGraphicFramePr>
               <a:graphicFrameLocks xmlns:a="http://schemas.openxmlformats.org/drawingml/2006/main" noChangeAspect="1"/>
             </wp:cNvGraphicFramePr>
@@ -31953,7 +31941,7 @@
               <a:graphicData uri="http://schemas.openxmlformats.org/drawingml/2006/picture">
                 <pic:pic xmlns:pic="http://schemas.openxmlformats.org/drawingml/2006/picture">
                   <pic:nvPicPr>
-                    <pic:cNvPr id="1132075693" name=""/>
+                    <pic:cNvPr id="406532510" name=""/>
                     <pic:cNvPicPr/>
                   </pic:nvPicPr>
                   <pic:blipFill>
@@ -31965,7 +31953,7 @@
                   <pic:spPr>
                     <a:xfrm>
                       <a:off x="0" y="0"/>
-                      <a:ext cx="4606492" cy="2411316"/>
+                      <a:ext cx="5018113" cy="2828382"/>
                     </a:xfrm>
                     <a:prstGeom prst="rect">
                       <a:avLst/>
@@ -32175,14 +32163,11 @@
     <w:p/>
     <w:p>
       <w:r>
-        <w:rPr>
-          <w:noProof/>
-        </w:rPr>
         <w:drawing>
-          <wp:inline distT="0" distB="0" distL="0" distR="0" wp14:anchorId="4D92885E" wp14:editId="153850A1">
-            <wp:extent cx="6241473" cy="3086744"/>
-            <wp:effectExtent l="0" t="0" r="6985" b="0"/>
-            <wp:docPr id="1749587307" name="Grafik 1"/>
+          <wp:inline distT="0" distB="0" distL="0" distR="0" wp14:anchorId="3E00AD30" wp14:editId="1710FF8D">
+            <wp:extent cx="5387414" cy="5730240"/>
+            <wp:effectExtent l="0" t="0" r="3810" b="3810"/>
+            <wp:docPr id="337920086" name="Grafik 1"/>
             <wp:cNvGraphicFramePr>
               <a:graphicFrameLocks xmlns:a="http://schemas.openxmlformats.org/drawingml/2006/main" noChangeAspect="1"/>
             </wp:cNvGraphicFramePr>
@@ -32190,7 +32175,7 @@
               <a:graphicData uri="http://schemas.openxmlformats.org/drawingml/2006/picture">
                 <pic:pic xmlns:pic="http://schemas.openxmlformats.org/drawingml/2006/picture">
                   <pic:nvPicPr>
-                    <pic:cNvPr id="1749587307" name=""/>
+                    <pic:cNvPr id="337920086" name=""/>
                     <pic:cNvPicPr/>
                   </pic:nvPicPr>
                   <pic:blipFill>
@@ -32202,49 +32187,7 @@
                   <pic:spPr>
                     <a:xfrm>
                       <a:off x="0" y="0"/>
-                      <a:ext cx="6255957" cy="3093907"/>
-                    </a:xfrm>
-                    <a:prstGeom prst="rect">
-                      <a:avLst/>
-                    </a:prstGeom>
-                  </pic:spPr>
-                </pic:pic>
-              </a:graphicData>
-            </a:graphic>
-          </wp:inline>
-        </w:drawing>
-      </w:r>
-    </w:p>
-    <w:p>
-      <w:r>
-        <w:rPr>
-          <w:noProof/>
-        </w:rPr>
-        <w:drawing>
-          <wp:inline distT="0" distB="0" distL="0" distR="0" wp14:anchorId="5FFB61E1" wp14:editId="760FB9E8">
-            <wp:extent cx="5357511" cy="3264877"/>
-            <wp:effectExtent l="0" t="0" r="0" b="0"/>
-            <wp:docPr id="1353562963" name="Grafik 1"/>
-            <wp:cNvGraphicFramePr>
-              <a:graphicFrameLocks xmlns:a="http://schemas.openxmlformats.org/drawingml/2006/main" noChangeAspect="1"/>
-            </wp:cNvGraphicFramePr>
-            <a:graphic xmlns:a="http://schemas.openxmlformats.org/drawingml/2006/main">
-              <a:graphicData uri="http://schemas.openxmlformats.org/drawingml/2006/picture">
-                <pic:pic xmlns:pic="http://schemas.openxmlformats.org/drawingml/2006/picture">
-                  <pic:nvPicPr>
-                    <pic:cNvPr id="1353562963" name=""/>
-                    <pic:cNvPicPr/>
-                  </pic:nvPicPr>
-                  <pic:blipFill>
-                    <a:blip r:embed="rId44"/>
-                    <a:stretch>
-                      <a:fillRect/>
-                    </a:stretch>
-                  </pic:blipFill>
-                  <pic:spPr>
-                    <a:xfrm>
-                      <a:off x="0" y="0"/>
-                      <a:ext cx="5360798" cy="3266880"/>
+                      <a:ext cx="5390432" cy="5733450"/>
                     </a:xfrm>
                     <a:prstGeom prst="rect">
                       <a:avLst/>
@@ -32458,7 +32401,7 @@
                     <pic:cNvPicPr/>
                   </pic:nvPicPr>
                   <pic:blipFill>
-                    <a:blip r:embed="rId45"/>
+                    <a:blip r:embed="rId44"/>
                     <a:stretch>
                       <a:fillRect/>
                     </a:stretch>
@@ -32509,7 +32452,7 @@
                     <pic:cNvPicPr/>
                   </pic:nvPicPr>
                   <pic:blipFill>
-                    <a:blip r:embed="rId46"/>
+                    <a:blip r:embed="rId45"/>
                     <a:stretch>
                       <a:fillRect/>
                     </a:stretch>
@@ -32552,7 +32495,7 @@
                     <pic:cNvPicPr/>
                   </pic:nvPicPr>
                   <pic:blipFill>
-                    <a:blip r:embed="rId47"/>
+                    <a:blip r:embed="rId46"/>
                     <a:stretch>
                       <a:fillRect/>
                     </a:stretch>
@@ -32594,7 +32537,7 @@
                     <pic:cNvPicPr/>
                   </pic:nvPicPr>
                   <pic:blipFill>
-                    <a:blip r:embed="rId48"/>
+                    <a:blip r:embed="rId47"/>
                     <a:stretch>
                       <a:fillRect/>
                     </a:stretch>
@@ -32814,7 +32757,7 @@
                     <pic:cNvPicPr/>
                   </pic:nvPicPr>
                   <pic:blipFill>
-                    <a:blip r:embed="rId49"/>
+                    <a:blip r:embed="rId48"/>
                     <a:stretch>
                       <a:fillRect/>
                     </a:stretch>
@@ -32857,7 +32800,7 @@
                     <pic:cNvPicPr/>
                   </pic:nvPicPr>
                   <pic:blipFill>
-                    <a:blip r:embed="rId50"/>
+                    <a:blip r:embed="rId49"/>
                     <a:stretch>
                       <a:fillRect/>
                     </a:stretch>
@@ -32900,7 +32843,7 @@
                     <pic:cNvPicPr/>
                   </pic:nvPicPr>
                   <pic:blipFill>
-                    <a:blip r:embed="rId51"/>
+                    <a:blip r:embed="rId50"/>
                     <a:stretch>
                       <a:fillRect/>
                     </a:stretch>
@@ -33086,7 +33029,7 @@
                     <pic:cNvPicPr/>
                   </pic:nvPicPr>
                   <pic:blipFill>
-                    <a:blip r:embed="rId52"/>
+                    <a:blip r:embed="rId51"/>
                     <a:stretch>
                       <a:fillRect/>
                     </a:stretch>
@@ -33129,7 +33072,7 @@
                     <pic:cNvPicPr/>
                   </pic:nvPicPr>
                   <pic:blipFill>
-                    <a:blip r:embed="rId53"/>
+                    <a:blip r:embed="rId52"/>
                     <a:stretch>
                       <a:fillRect/>
                     </a:stretch>
@@ -33172,7 +33115,7 @@
                     <pic:cNvPicPr/>
                   </pic:nvPicPr>
                   <pic:blipFill>
-                    <a:blip r:embed="rId54"/>
+                    <a:blip r:embed="rId53"/>
                     <a:stretch>
                       <a:fillRect/>
                     </a:stretch>
@@ -34533,7 +34476,7 @@
                           <pic:cNvPicPr/>
                         </pic:nvPicPr>
                         <pic:blipFill>
-                          <a:blip r:embed="rId55"/>
+                          <a:blip r:embed="rId54"/>
                           <a:stretch>
                             <a:fillRect/>
                           </a:stretch>
@@ -34660,7 +34603,7 @@
     <w:p>
       <w:pPr>
         <w:sectPr>
-          <w:headerReference w:type="default" r:id="rId56"/>
+          <w:headerReference w:type="default" r:id="rId55"/>
           <w:pgSz w:w="11906" w:h="16838"/>
           <w:pgMar w:top="720" w:right="720" w:bottom="720" w:left="720" w:header="708" w:footer="708" w:gutter="0"/>
           <w:cols w:space="708"/>
@@ -34738,7 +34681,7 @@
             <w:tcW w:w="5240" w:type="dxa"/>
           </w:tcPr>
           <w:p>
-            <w:hyperlink r:id="rId57" w:history="1">
+            <w:hyperlink r:id="rId56" w:history="1">
               <w:r>
                 <w:rPr>
                   <w:rStyle w:val="Hyperlink"/>
@@ -34765,7 +34708,7 @@
             <w:tcW w:w="5240" w:type="dxa"/>
           </w:tcPr>
           <w:p>
-            <w:hyperlink r:id="rId58" w:history="1">
+            <w:hyperlink r:id="rId57" w:history="1">
               <w:r>
                 <w:rPr>
                   <w:rStyle w:val="Hyperlink"/>
@@ -34832,15 +34775,7 @@
             </w:r>
             <w:proofErr w:type="spellEnd"/>
             <w:r>
-              <w:t xml:space="preserve"> </w:t>
-            </w:r>
-            <w:proofErr w:type="spellStart"/>
-            <w:r>
-              <w:t>Starch</w:t>
-            </w:r>
-            <w:proofErr w:type="spellEnd"/>
-            <w:r>
-              <w:t xml:space="preserve"> Press, San Francisco</w:t>
+              <w:t xml:space="preserve"> Starch Press, San Francisco</w:t>
             </w:r>
           </w:p>
         </w:tc>
@@ -34864,7 +34799,7 @@
             <w:tcW w:w="5240" w:type="dxa"/>
           </w:tcPr>
           <w:p>
-            <w:hyperlink r:id="rId59" w:history="1">
+            <w:hyperlink r:id="rId58" w:history="1">
               <w:r>
                 <w:rPr>
                   <w:rStyle w:val="Hyperlink"/>
@@ -34891,7 +34826,7 @@
             <w:tcW w:w="5240" w:type="dxa"/>
           </w:tcPr>
           <w:p>
-            <w:hyperlink r:id="rId60" w:history="1">
+            <w:hyperlink r:id="rId59" w:history="1">
               <w:r>
                 <w:rPr>
                   <w:rStyle w:val="Hyperlink"/>
@@ -34923,7 +34858,7 @@
             <w:tcW w:w="5240" w:type="dxa"/>
           </w:tcPr>
           <w:p>
-            <w:hyperlink r:id="rId61" w:history="1">
+            <w:hyperlink r:id="rId60" w:history="1">
               <w:r>
                 <w:rPr>
                   <w:rStyle w:val="Hyperlink"/>
@@ -34950,7 +34885,7 @@
             <w:tcW w:w="5240" w:type="dxa"/>
           </w:tcPr>
           <w:p>
-            <w:hyperlink r:id="rId62" w:history="1">
+            <w:hyperlink r:id="rId61" w:history="1">
               <w:r>
                 <w:rPr>
                   <w:rStyle w:val="Hyperlink"/>
@@ -34977,7 +34912,7 @@
             <w:tcW w:w="5240" w:type="dxa"/>
           </w:tcPr>
           <w:p>
-            <w:hyperlink r:id="rId63" w:history="1">
+            <w:hyperlink r:id="rId62" w:history="1">
               <w:r>
                 <w:rPr>
                   <w:rStyle w:val="Hyperlink"/>
@@ -35004,7 +34939,7 @@
             <w:tcW w:w="5240" w:type="dxa"/>
           </w:tcPr>
           <w:p>
-            <w:hyperlink r:id="rId64" w:history="1">
+            <w:hyperlink r:id="rId63" w:history="1">
               <w:r>
                 <w:rPr>
                   <w:rStyle w:val="Hyperlink"/>
@@ -35019,13 +34954,8 @@
             <w:tcW w:w="5216" w:type="dxa"/>
           </w:tcPr>
           <w:p>
-            <w:proofErr w:type="spellStart"/>
-            <w:r>
-              <w:t>Pledge</w:t>
-            </w:r>
-            <w:proofErr w:type="spellEnd"/>
-            <w:r>
-              <w:t xml:space="preserve"> Algorithmus</w:t>
+            <w:r>
+              <w:t>Pledge Algorithmus</w:t>
             </w:r>
           </w:p>
         </w:tc>
@@ -35036,7 +34966,7 @@
             <w:tcW w:w="5240" w:type="dxa"/>
           </w:tcPr>
           <w:p>
-            <w:hyperlink r:id="rId65" w:history="1">
+            <w:hyperlink r:id="rId64" w:history="1">
               <w:r>
                 <w:rPr>
                   <w:rStyle w:val="Hyperlink"/>
@@ -35068,7 +34998,7 @@
             <w:tcW w:w="5240" w:type="dxa"/>
           </w:tcPr>
           <w:p>
-            <w:hyperlink r:id="rId66" w:history="1">
+            <w:hyperlink r:id="rId65" w:history="1">
               <w:r>
                 <w:rPr>
                   <w:rStyle w:val="Hyperlink"/>
@@ -35095,7 +35025,7 @@
     </w:tbl>
     <w:p/>
     <w:sectPr>
-      <w:headerReference w:type="default" r:id="rId67"/>
+      <w:headerReference w:type="default" r:id="rId66"/>
       <w:pgSz w:w="11906" w:h="16838"/>
       <w:pgMar w:top="720" w:right="720" w:bottom="720" w:left="720" w:header="708" w:footer="708" w:gutter="0"/>
       <w:cols w:space="708"/>
@@ -35232,7 +35162,7 @@
       <w:rPr>
         <w:noProof/>
       </w:rPr>
-      <w:t>29.12.2025</w:t>
+      <w:t>29.01.2026</w:t>
     </w:r>
     <w:r>
       <w:rPr>

</xml_diff>

<commit_message>
Seite 34-37: Programmcode aktualisiert Seite 38: Anleitung aktualisiert
</commit_message>
<xml_diff>
--- a/Doc/Arbeitsblaetter_2025.docx
+++ b/Doc/Arbeitsblaetter_2025.docx
@@ -41,6 +41,7 @@
       <w:bookmarkStart w:id="14" w:name="_Toc200568165"/>
       <w:bookmarkStart w:id="15" w:name="_Toc200621537"/>
       <w:bookmarkStart w:id="16" w:name="_Toc213070185"/>
+      <w:bookmarkStart w:id="17" w:name="_Toc220769210"/>
       <w:r>
         <w:rPr>
           <w:b/>
@@ -65,6 +66,7 @@
       <w:bookmarkEnd w:id="14"/>
       <w:bookmarkEnd w:id="15"/>
       <w:bookmarkEnd w:id="16"/>
+      <w:bookmarkEnd w:id="17"/>
       <w:r>
         <w:rPr>
           <w:b/>
@@ -86,21 +88,22 @@
           <w:szCs w:val="56"/>
         </w:rPr>
       </w:pPr>
-      <w:bookmarkStart w:id="17" w:name="_Toc199401691"/>
-      <w:bookmarkStart w:id="18" w:name="_Toc199402088"/>
-      <w:bookmarkStart w:id="19" w:name="_Toc199402324"/>
-      <w:bookmarkStart w:id="20" w:name="_Toc199403158"/>
-      <w:bookmarkStart w:id="21" w:name="_Toc199405788"/>
-      <w:bookmarkStart w:id="22" w:name="_Toc199406899"/>
-      <w:bookmarkStart w:id="23" w:name="_Toc199431746"/>
-      <w:bookmarkStart w:id="24" w:name="_Toc200225435"/>
-      <w:bookmarkStart w:id="25" w:name="_Toc200225862"/>
-      <w:bookmarkStart w:id="26" w:name="_Toc200226683"/>
-      <w:bookmarkStart w:id="27" w:name="_Toc200314818"/>
-      <w:bookmarkStart w:id="28" w:name="_Toc200450323"/>
-      <w:bookmarkStart w:id="29" w:name="_Toc200568166"/>
-      <w:bookmarkStart w:id="30" w:name="_Toc200621538"/>
-      <w:bookmarkStart w:id="31" w:name="_Toc213070186"/>
+      <w:bookmarkStart w:id="18" w:name="_Toc199401691"/>
+      <w:bookmarkStart w:id="19" w:name="_Toc199402088"/>
+      <w:bookmarkStart w:id="20" w:name="_Toc199402324"/>
+      <w:bookmarkStart w:id="21" w:name="_Toc199403158"/>
+      <w:bookmarkStart w:id="22" w:name="_Toc199405788"/>
+      <w:bookmarkStart w:id="23" w:name="_Toc199406899"/>
+      <w:bookmarkStart w:id="24" w:name="_Toc199431746"/>
+      <w:bookmarkStart w:id="25" w:name="_Toc200225435"/>
+      <w:bookmarkStart w:id="26" w:name="_Toc200225862"/>
+      <w:bookmarkStart w:id="27" w:name="_Toc200226683"/>
+      <w:bookmarkStart w:id="28" w:name="_Toc200314818"/>
+      <w:bookmarkStart w:id="29" w:name="_Toc200450323"/>
+      <w:bookmarkStart w:id="30" w:name="_Toc200568166"/>
+      <w:bookmarkStart w:id="31" w:name="_Toc200621538"/>
+      <w:bookmarkStart w:id="32" w:name="_Toc213070186"/>
+      <w:bookmarkStart w:id="33" w:name="_Toc220769211"/>
       <w:r>
         <w:rPr>
           <w:b/>
@@ -110,7 +113,6 @@
         </w:rPr>
         <w:t>mit Python IDLE</w:t>
       </w:r>
-      <w:bookmarkEnd w:id="17"/>
       <w:bookmarkEnd w:id="18"/>
       <w:bookmarkEnd w:id="19"/>
       <w:bookmarkEnd w:id="20"/>
@@ -125,6 +127,8 @@
       <w:bookmarkEnd w:id="29"/>
       <w:bookmarkEnd w:id="30"/>
       <w:bookmarkEnd w:id="31"/>
+      <w:bookmarkEnd w:id="32"/>
+      <w:bookmarkEnd w:id="33"/>
     </w:p>
     <w:p/>
     <w:p/>
@@ -188,21 +192,22 @@
           <w:szCs w:val="32"/>
         </w:rPr>
       </w:pPr>
-      <w:bookmarkStart w:id="32" w:name="_Toc199401692"/>
-      <w:bookmarkStart w:id="33" w:name="_Toc199402089"/>
-      <w:bookmarkStart w:id="34" w:name="_Toc199402325"/>
-      <w:bookmarkStart w:id="35" w:name="_Toc199403159"/>
-      <w:bookmarkStart w:id="36" w:name="_Toc199405789"/>
-      <w:bookmarkStart w:id="37" w:name="_Toc199406900"/>
-      <w:bookmarkStart w:id="38" w:name="_Toc199431747"/>
-      <w:bookmarkStart w:id="39" w:name="_Toc200225436"/>
-      <w:bookmarkStart w:id="40" w:name="_Toc200225863"/>
-      <w:bookmarkStart w:id="41" w:name="_Toc200226684"/>
-      <w:bookmarkStart w:id="42" w:name="_Toc200314819"/>
-      <w:bookmarkStart w:id="43" w:name="_Toc200450324"/>
-      <w:bookmarkStart w:id="44" w:name="_Toc200568167"/>
-      <w:bookmarkStart w:id="45" w:name="_Toc200621539"/>
-      <w:bookmarkStart w:id="46" w:name="_Toc213070187"/>
+      <w:bookmarkStart w:id="34" w:name="_Toc199401692"/>
+      <w:bookmarkStart w:id="35" w:name="_Toc199402089"/>
+      <w:bookmarkStart w:id="36" w:name="_Toc199402325"/>
+      <w:bookmarkStart w:id="37" w:name="_Toc199403159"/>
+      <w:bookmarkStart w:id="38" w:name="_Toc199405789"/>
+      <w:bookmarkStart w:id="39" w:name="_Toc199406900"/>
+      <w:bookmarkStart w:id="40" w:name="_Toc199431747"/>
+      <w:bookmarkStart w:id="41" w:name="_Toc200225436"/>
+      <w:bookmarkStart w:id="42" w:name="_Toc200225863"/>
+      <w:bookmarkStart w:id="43" w:name="_Toc200226684"/>
+      <w:bookmarkStart w:id="44" w:name="_Toc200314819"/>
+      <w:bookmarkStart w:id="45" w:name="_Toc200450324"/>
+      <w:bookmarkStart w:id="46" w:name="_Toc200568167"/>
+      <w:bookmarkStart w:id="47" w:name="_Toc200621539"/>
+      <w:bookmarkStart w:id="48" w:name="_Toc213070187"/>
+      <w:bookmarkStart w:id="49" w:name="_Toc220769212"/>
       <w:r>
         <w:rPr>
           <w:sz w:val="32"/>
@@ -210,8 +215,6 @@
         </w:rPr>
         <w:t>Arbeitsblätter zum Kurs</w:t>
       </w:r>
-      <w:bookmarkEnd w:id="32"/>
-      <w:bookmarkEnd w:id="33"/>
       <w:bookmarkEnd w:id="34"/>
       <w:bookmarkEnd w:id="35"/>
       <w:bookmarkEnd w:id="36"/>
@@ -225,6 +228,9 @@
       <w:bookmarkEnd w:id="44"/>
       <w:bookmarkEnd w:id="45"/>
       <w:bookmarkEnd w:id="46"/>
+      <w:bookmarkEnd w:id="47"/>
+      <w:bookmarkEnd w:id="48"/>
+      <w:bookmarkEnd w:id="49"/>
     </w:p>
     <w:p/>
     <w:p>
@@ -273,7 +279,7 @@
       <w:r>
         <w:fldChar w:fldCharType="separate"/>
       </w:r>
-      <w:hyperlink w:anchor="_Toc213070188" w:history="1">
+      <w:hyperlink w:anchor="_Toc220769213" w:history="1">
         <w:r>
           <w:rPr>
             <w:rStyle w:val="Hyperlink"/>
@@ -300,7 +306,7 @@
             <w:noProof/>
             <w:webHidden/>
           </w:rPr>
-          <w:instrText xml:space="preserve"> PAGEREF _Toc213070188 \h </w:instrText>
+          <w:instrText xml:space="preserve"> PAGEREF _Toc220769213 \h </w:instrText>
         </w:r>
         <w:r>
           <w:rPr>
@@ -345,7 +351,7 @@
           <w:lang w:eastAsia="de-DE"/>
         </w:rPr>
       </w:pPr>
-      <w:hyperlink w:anchor="_Toc213070189" w:history="1">
+      <w:hyperlink w:anchor="_Toc220769214" w:history="1">
         <w:r>
           <w:rPr>
             <w:rStyle w:val="Hyperlink"/>
@@ -372,7 +378,7 @@
             <w:noProof/>
             <w:webHidden/>
           </w:rPr>
-          <w:instrText xml:space="preserve"> PAGEREF _Toc213070189 \h </w:instrText>
+          <w:instrText xml:space="preserve"> PAGEREF _Toc220769214 \h </w:instrText>
         </w:r>
         <w:r>
           <w:rPr>
@@ -417,7 +423,7 @@
           <w:lang w:eastAsia="de-DE"/>
         </w:rPr>
       </w:pPr>
-      <w:hyperlink w:anchor="_Toc213070190" w:history="1">
+      <w:hyperlink w:anchor="_Toc220769215" w:history="1">
         <w:r>
           <w:rPr>
             <w:rStyle w:val="Hyperlink"/>
@@ -444,7 +450,7 @@
             <w:noProof/>
             <w:webHidden/>
           </w:rPr>
-          <w:instrText xml:space="preserve"> PAGEREF _Toc213070190 \h </w:instrText>
+          <w:instrText xml:space="preserve"> PAGEREF _Toc220769215 \h </w:instrText>
         </w:r>
         <w:r>
           <w:rPr>
@@ -489,7 +495,7 @@
           <w:lang w:eastAsia="de-DE"/>
         </w:rPr>
       </w:pPr>
-      <w:hyperlink w:anchor="_Toc213070191" w:history="1">
+      <w:hyperlink w:anchor="_Toc220769216" w:history="1">
         <w:r>
           <w:rPr>
             <w:rStyle w:val="Hyperlink"/>
@@ -516,7 +522,7 @@
             <w:noProof/>
             <w:webHidden/>
           </w:rPr>
-          <w:instrText xml:space="preserve"> PAGEREF _Toc213070191 \h </w:instrText>
+          <w:instrText xml:space="preserve"> PAGEREF _Toc220769216 \h </w:instrText>
         </w:r>
         <w:r>
           <w:rPr>
@@ -561,7 +567,7 @@
           <w:lang w:eastAsia="de-DE"/>
         </w:rPr>
       </w:pPr>
-      <w:hyperlink w:anchor="_Toc213070192" w:history="1">
+      <w:hyperlink w:anchor="_Toc220769217" w:history="1">
         <w:r>
           <w:rPr>
             <w:rStyle w:val="Hyperlink"/>
@@ -588,7 +594,7 @@
             <w:noProof/>
             <w:webHidden/>
           </w:rPr>
-          <w:instrText xml:space="preserve"> PAGEREF _Toc213070192 \h </w:instrText>
+          <w:instrText xml:space="preserve"> PAGEREF _Toc220769217 \h </w:instrText>
         </w:r>
         <w:r>
           <w:rPr>
@@ -633,7 +639,7 @@
           <w:lang w:eastAsia="de-DE"/>
         </w:rPr>
       </w:pPr>
-      <w:hyperlink w:anchor="_Toc213070193" w:history="1">
+      <w:hyperlink w:anchor="_Toc220769218" w:history="1">
         <w:r>
           <w:rPr>
             <w:rStyle w:val="Hyperlink"/>
@@ -660,7 +666,7 @@
             <w:noProof/>
             <w:webHidden/>
           </w:rPr>
-          <w:instrText xml:space="preserve"> PAGEREF _Toc213070193 \h </w:instrText>
+          <w:instrText xml:space="preserve"> PAGEREF _Toc220769218 \h </w:instrText>
         </w:r>
         <w:r>
           <w:rPr>
@@ -705,7 +711,7 @@
           <w:lang w:eastAsia="de-DE"/>
         </w:rPr>
       </w:pPr>
-      <w:hyperlink w:anchor="_Toc213070194" w:history="1">
+      <w:hyperlink w:anchor="_Toc220769219" w:history="1">
         <w:r>
           <w:rPr>
             <w:rStyle w:val="Hyperlink"/>
@@ -732,7 +738,7 @@
             <w:noProof/>
             <w:webHidden/>
           </w:rPr>
-          <w:instrText xml:space="preserve"> PAGEREF _Toc213070194 \h </w:instrText>
+          <w:instrText xml:space="preserve"> PAGEREF _Toc220769219 \h </w:instrText>
         </w:r>
         <w:r>
           <w:rPr>
@@ -777,7 +783,7 @@
           <w:lang w:eastAsia="de-DE"/>
         </w:rPr>
       </w:pPr>
-      <w:hyperlink w:anchor="_Toc213070195" w:history="1">
+      <w:hyperlink w:anchor="_Toc220769220" w:history="1">
         <w:r>
           <w:rPr>
             <w:rStyle w:val="Hyperlink"/>
@@ -804,7 +810,7 @@
             <w:noProof/>
             <w:webHidden/>
           </w:rPr>
-          <w:instrText xml:space="preserve"> PAGEREF _Toc213070195 \h </w:instrText>
+          <w:instrText xml:space="preserve"> PAGEREF _Toc220769220 \h </w:instrText>
         </w:r>
         <w:r>
           <w:rPr>
@@ -849,7 +855,7 @@
           <w:lang w:eastAsia="de-DE"/>
         </w:rPr>
       </w:pPr>
-      <w:hyperlink w:anchor="_Toc213070196" w:history="1">
+      <w:hyperlink w:anchor="_Toc220769221" w:history="1">
         <w:r>
           <w:rPr>
             <w:rStyle w:val="Hyperlink"/>
@@ -876,7 +882,7 @@
             <w:noProof/>
             <w:webHidden/>
           </w:rPr>
-          <w:instrText xml:space="preserve"> PAGEREF _Toc213070196 \h </w:instrText>
+          <w:instrText xml:space="preserve"> PAGEREF _Toc220769221 \h </w:instrText>
         </w:r>
         <w:r>
           <w:rPr>
@@ -921,7 +927,7 @@
           <w:lang w:eastAsia="de-DE"/>
         </w:rPr>
       </w:pPr>
-      <w:hyperlink w:anchor="_Toc213070197" w:history="1">
+      <w:hyperlink w:anchor="_Toc220769222" w:history="1">
         <w:r>
           <w:rPr>
             <w:rStyle w:val="Hyperlink"/>
@@ -948,7 +954,7 @@
             <w:noProof/>
             <w:webHidden/>
           </w:rPr>
-          <w:instrText xml:space="preserve"> PAGEREF _Toc213070197 \h </w:instrText>
+          <w:instrText xml:space="preserve"> PAGEREF _Toc220769222 \h </w:instrText>
         </w:r>
         <w:r>
           <w:rPr>
@@ -993,7 +999,7 @@
           <w:lang w:eastAsia="de-DE"/>
         </w:rPr>
       </w:pPr>
-      <w:hyperlink w:anchor="_Toc213070198" w:history="1">
+      <w:hyperlink w:anchor="_Toc220769223" w:history="1">
         <w:r>
           <w:rPr>
             <w:rStyle w:val="Hyperlink"/>
@@ -1020,7 +1026,7 @@
             <w:noProof/>
             <w:webHidden/>
           </w:rPr>
-          <w:instrText xml:space="preserve"> PAGEREF _Toc213070198 \h </w:instrText>
+          <w:instrText xml:space="preserve"> PAGEREF _Toc220769223 \h </w:instrText>
         </w:r>
         <w:r>
           <w:rPr>
@@ -1065,7 +1071,7 @@
           <w:lang w:eastAsia="de-DE"/>
         </w:rPr>
       </w:pPr>
-      <w:hyperlink w:anchor="_Toc213070199" w:history="1">
+      <w:hyperlink w:anchor="_Toc220769224" w:history="1">
         <w:r>
           <w:rPr>
             <w:rStyle w:val="Hyperlink"/>
@@ -1092,7 +1098,7 @@
             <w:noProof/>
             <w:webHidden/>
           </w:rPr>
-          <w:instrText xml:space="preserve"> PAGEREF _Toc213070199 \h </w:instrText>
+          <w:instrText xml:space="preserve"> PAGEREF _Toc220769224 \h </w:instrText>
         </w:r>
         <w:r>
           <w:rPr>
@@ -1137,7 +1143,7 @@
           <w:lang w:eastAsia="de-DE"/>
         </w:rPr>
       </w:pPr>
-      <w:hyperlink w:anchor="_Toc213070200" w:history="1">
+      <w:hyperlink w:anchor="_Toc220769225" w:history="1">
         <w:r>
           <w:rPr>
             <w:rStyle w:val="Hyperlink"/>
@@ -1164,7 +1170,7 @@
             <w:noProof/>
             <w:webHidden/>
           </w:rPr>
-          <w:instrText xml:space="preserve"> PAGEREF _Toc213070200 \h </w:instrText>
+          <w:instrText xml:space="preserve"> PAGEREF _Toc220769225 \h </w:instrText>
         </w:r>
         <w:r>
           <w:rPr>
@@ -1209,7 +1215,7 @@
           <w:lang w:eastAsia="de-DE"/>
         </w:rPr>
       </w:pPr>
-      <w:hyperlink w:anchor="_Toc213070201" w:history="1">
+      <w:hyperlink w:anchor="_Toc220769226" w:history="1">
         <w:r>
           <w:rPr>
             <w:rStyle w:val="Hyperlink"/>
@@ -1236,7 +1242,7 @@
             <w:noProof/>
             <w:webHidden/>
           </w:rPr>
-          <w:instrText xml:space="preserve"> PAGEREF _Toc213070201 \h </w:instrText>
+          <w:instrText xml:space="preserve"> PAGEREF _Toc220769226 \h </w:instrText>
         </w:r>
         <w:r>
           <w:rPr>
@@ -1281,7 +1287,7 @@
           <w:lang w:eastAsia="de-DE"/>
         </w:rPr>
       </w:pPr>
-      <w:hyperlink w:anchor="_Toc213070202" w:history="1">
+      <w:hyperlink w:anchor="_Toc220769227" w:history="1">
         <w:r>
           <w:rPr>
             <w:rStyle w:val="Hyperlink"/>
@@ -1308,7 +1314,7 @@
             <w:noProof/>
             <w:webHidden/>
           </w:rPr>
-          <w:instrText xml:space="preserve"> PAGEREF _Toc213070202 \h </w:instrText>
+          <w:instrText xml:space="preserve"> PAGEREF _Toc220769227 \h </w:instrText>
         </w:r>
         <w:r>
           <w:rPr>
@@ -1353,7 +1359,7 @@
           <w:lang w:eastAsia="de-DE"/>
         </w:rPr>
       </w:pPr>
-      <w:hyperlink w:anchor="_Toc213070203" w:history="1">
+      <w:hyperlink w:anchor="_Toc220769228" w:history="1">
         <w:r>
           <w:rPr>
             <w:rStyle w:val="Hyperlink"/>
@@ -1380,7 +1386,7 @@
             <w:noProof/>
             <w:webHidden/>
           </w:rPr>
-          <w:instrText xml:space="preserve"> PAGEREF _Toc213070203 \h </w:instrText>
+          <w:instrText xml:space="preserve"> PAGEREF _Toc220769228 \h </w:instrText>
         </w:r>
         <w:r>
           <w:rPr>
@@ -1425,7 +1431,7 @@
           <w:lang w:eastAsia="de-DE"/>
         </w:rPr>
       </w:pPr>
-      <w:hyperlink w:anchor="_Toc213070204" w:history="1">
+      <w:hyperlink w:anchor="_Toc220769229" w:history="1">
         <w:r>
           <w:rPr>
             <w:rStyle w:val="Hyperlink"/>
@@ -1452,7 +1458,7 @@
             <w:noProof/>
             <w:webHidden/>
           </w:rPr>
-          <w:instrText xml:space="preserve"> PAGEREF _Toc213070204 \h </w:instrText>
+          <w:instrText xml:space="preserve"> PAGEREF _Toc220769229 \h </w:instrText>
         </w:r>
         <w:r>
           <w:rPr>
@@ -1497,7 +1503,7 @@
           <w:lang w:eastAsia="de-DE"/>
         </w:rPr>
       </w:pPr>
-      <w:hyperlink w:anchor="_Toc213070205" w:history="1">
+      <w:hyperlink w:anchor="_Toc220769230" w:history="1">
         <w:r>
           <w:rPr>
             <w:rStyle w:val="Hyperlink"/>
@@ -1524,7 +1530,7 @@
             <w:noProof/>
             <w:webHidden/>
           </w:rPr>
-          <w:instrText xml:space="preserve"> PAGEREF _Toc213070205 \h </w:instrText>
+          <w:instrText xml:space="preserve"> PAGEREF _Toc220769230 \h </w:instrText>
         </w:r>
         <w:r>
           <w:rPr>
@@ -1569,7 +1575,7 @@
           <w:lang w:eastAsia="de-DE"/>
         </w:rPr>
       </w:pPr>
-      <w:hyperlink w:anchor="_Toc213070206" w:history="1">
+      <w:hyperlink w:anchor="_Toc220769231" w:history="1">
         <w:r>
           <w:rPr>
             <w:rStyle w:val="Hyperlink"/>
@@ -1596,7 +1602,7 @@
             <w:noProof/>
             <w:webHidden/>
           </w:rPr>
-          <w:instrText xml:space="preserve"> PAGEREF _Toc213070206 \h </w:instrText>
+          <w:instrText xml:space="preserve"> PAGEREF _Toc220769231 \h </w:instrText>
         </w:r>
         <w:r>
           <w:rPr>
@@ -1641,7 +1647,7 @@
           <w:lang w:eastAsia="de-DE"/>
         </w:rPr>
       </w:pPr>
-      <w:hyperlink w:anchor="_Toc213070207" w:history="1">
+      <w:hyperlink w:anchor="_Toc220769232" w:history="1">
         <w:r>
           <w:rPr>
             <w:rStyle w:val="Hyperlink"/>
@@ -1668,7 +1674,7 @@
             <w:noProof/>
             <w:webHidden/>
           </w:rPr>
-          <w:instrText xml:space="preserve"> PAGEREF _Toc213070207 \h </w:instrText>
+          <w:instrText xml:space="preserve"> PAGEREF _Toc220769232 \h </w:instrText>
         </w:r>
         <w:r>
           <w:rPr>
@@ -1713,7 +1719,7 @@
           <w:lang w:eastAsia="de-DE"/>
         </w:rPr>
       </w:pPr>
-      <w:hyperlink w:anchor="_Toc213070208" w:history="1">
+      <w:hyperlink w:anchor="_Toc220769233" w:history="1">
         <w:r>
           <w:rPr>
             <w:rStyle w:val="Hyperlink"/>
@@ -1740,7 +1746,7 @@
             <w:noProof/>
             <w:webHidden/>
           </w:rPr>
-          <w:instrText xml:space="preserve"> PAGEREF _Toc213070208 \h </w:instrText>
+          <w:instrText xml:space="preserve"> PAGEREF _Toc220769233 \h </w:instrText>
         </w:r>
         <w:r>
           <w:rPr>
@@ -1785,7 +1791,7 @@
           <w:lang w:eastAsia="de-DE"/>
         </w:rPr>
       </w:pPr>
-      <w:hyperlink w:anchor="_Toc213070209" w:history="1">
+      <w:hyperlink w:anchor="_Toc220769234" w:history="1">
         <w:r>
           <w:rPr>
             <w:rStyle w:val="Hyperlink"/>
@@ -1812,7 +1818,7 @@
             <w:noProof/>
             <w:webHidden/>
           </w:rPr>
-          <w:instrText xml:space="preserve"> PAGEREF _Toc213070209 \h </w:instrText>
+          <w:instrText xml:space="preserve"> PAGEREF _Toc220769234 \h </w:instrText>
         </w:r>
         <w:r>
           <w:rPr>
@@ -1857,7 +1863,7 @@
           <w:lang w:eastAsia="de-DE"/>
         </w:rPr>
       </w:pPr>
-      <w:hyperlink w:anchor="_Toc213070210" w:history="1">
+      <w:hyperlink w:anchor="_Toc220769235" w:history="1">
         <w:r>
           <w:rPr>
             <w:rStyle w:val="Hyperlink"/>
@@ -1884,7 +1890,7 @@
             <w:noProof/>
             <w:webHidden/>
           </w:rPr>
-          <w:instrText xml:space="preserve"> PAGEREF _Toc213070210 \h </w:instrText>
+          <w:instrText xml:space="preserve"> PAGEREF _Toc220769235 \h </w:instrText>
         </w:r>
         <w:r>
           <w:rPr>
@@ -1929,7 +1935,7 @@
           <w:lang w:eastAsia="de-DE"/>
         </w:rPr>
       </w:pPr>
-      <w:hyperlink w:anchor="_Toc213070211" w:history="1">
+      <w:hyperlink w:anchor="_Toc220769236" w:history="1">
         <w:r>
           <w:rPr>
             <w:rStyle w:val="Hyperlink"/>
@@ -1956,7 +1962,7 @@
             <w:noProof/>
             <w:webHidden/>
           </w:rPr>
-          <w:instrText xml:space="preserve"> PAGEREF _Toc213070211 \h </w:instrText>
+          <w:instrText xml:space="preserve"> PAGEREF _Toc220769236 \h </w:instrText>
         </w:r>
         <w:r>
           <w:rPr>
@@ -2001,7 +2007,7 @@
           <w:lang w:eastAsia="de-DE"/>
         </w:rPr>
       </w:pPr>
-      <w:hyperlink w:anchor="_Toc213070212" w:history="1">
+      <w:hyperlink w:anchor="_Toc220769237" w:history="1">
         <w:r>
           <w:rPr>
             <w:rStyle w:val="Hyperlink"/>
@@ -2028,7 +2034,7 @@
             <w:noProof/>
             <w:webHidden/>
           </w:rPr>
-          <w:instrText xml:space="preserve"> PAGEREF _Toc213070212 \h </w:instrText>
+          <w:instrText xml:space="preserve"> PAGEREF _Toc220769237 \h </w:instrText>
         </w:r>
         <w:r>
           <w:rPr>
@@ -2073,7 +2079,7 @@
           <w:lang w:eastAsia="de-DE"/>
         </w:rPr>
       </w:pPr>
-      <w:hyperlink w:anchor="_Toc213070213" w:history="1">
+      <w:hyperlink w:anchor="_Toc220769238" w:history="1">
         <w:r>
           <w:rPr>
             <w:rStyle w:val="Hyperlink"/>
@@ -2100,7 +2106,7 @@
             <w:noProof/>
             <w:webHidden/>
           </w:rPr>
-          <w:instrText xml:space="preserve"> PAGEREF _Toc213070213 \h </w:instrText>
+          <w:instrText xml:space="preserve"> PAGEREF _Toc220769238 \h </w:instrText>
         </w:r>
         <w:r>
           <w:rPr>
@@ -2145,7 +2151,7 @@
           <w:lang w:eastAsia="de-DE"/>
         </w:rPr>
       </w:pPr>
-      <w:hyperlink w:anchor="_Toc213070214" w:history="1">
+      <w:hyperlink w:anchor="_Toc220769239" w:history="1">
         <w:r>
           <w:rPr>
             <w:rStyle w:val="Hyperlink"/>
@@ -2172,7 +2178,7 @@
             <w:noProof/>
             <w:webHidden/>
           </w:rPr>
-          <w:instrText xml:space="preserve"> PAGEREF _Toc213070214 \h </w:instrText>
+          <w:instrText xml:space="preserve"> PAGEREF _Toc220769239 \h </w:instrText>
         </w:r>
         <w:r>
           <w:rPr>
@@ -2217,7 +2223,7 @@
           <w:lang w:eastAsia="de-DE"/>
         </w:rPr>
       </w:pPr>
-      <w:hyperlink w:anchor="_Toc213070215" w:history="1">
+      <w:hyperlink w:anchor="_Toc220769240" w:history="1">
         <w:r>
           <w:rPr>
             <w:rStyle w:val="Hyperlink"/>
@@ -2244,7 +2250,7 @@
             <w:noProof/>
             <w:webHidden/>
           </w:rPr>
-          <w:instrText xml:space="preserve"> PAGEREF _Toc213070215 \h </w:instrText>
+          <w:instrText xml:space="preserve"> PAGEREF _Toc220769240 \h </w:instrText>
         </w:r>
         <w:r>
           <w:rPr>
@@ -2289,7 +2295,7 @@
           <w:lang w:eastAsia="de-DE"/>
         </w:rPr>
       </w:pPr>
-      <w:hyperlink w:anchor="_Toc213070216" w:history="1">
+      <w:hyperlink w:anchor="_Toc220769241" w:history="1">
         <w:r>
           <w:rPr>
             <w:rStyle w:val="Hyperlink"/>
@@ -2316,7 +2322,7 @@
             <w:noProof/>
             <w:webHidden/>
           </w:rPr>
-          <w:instrText xml:space="preserve"> PAGEREF _Toc213070216 \h </w:instrText>
+          <w:instrText xml:space="preserve"> PAGEREF _Toc220769241 \h </w:instrText>
         </w:r>
         <w:r>
           <w:rPr>
@@ -2361,7 +2367,7 @@
           <w:lang w:eastAsia="de-DE"/>
         </w:rPr>
       </w:pPr>
-      <w:hyperlink w:anchor="_Toc213070217" w:history="1">
+      <w:hyperlink w:anchor="_Toc220769242" w:history="1">
         <w:r>
           <w:rPr>
             <w:rStyle w:val="Hyperlink"/>
@@ -2388,7 +2394,7 @@
             <w:noProof/>
             <w:webHidden/>
           </w:rPr>
-          <w:instrText xml:space="preserve"> PAGEREF _Toc213070217 \h </w:instrText>
+          <w:instrText xml:space="preserve"> PAGEREF _Toc220769242 \h </w:instrText>
         </w:r>
         <w:r>
           <w:rPr>
@@ -2433,7 +2439,7 @@
           <w:lang w:eastAsia="de-DE"/>
         </w:rPr>
       </w:pPr>
-      <w:hyperlink w:anchor="_Toc213070218" w:history="1">
+      <w:hyperlink w:anchor="_Toc220769243" w:history="1">
         <w:r>
           <w:rPr>
             <w:rStyle w:val="Hyperlink"/>
@@ -2460,7 +2466,7 @@
             <w:noProof/>
             <w:webHidden/>
           </w:rPr>
-          <w:instrText xml:space="preserve"> PAGEREF _Toc213070218 \h </w:instrText>
+          <w:instrText xml:space="preserve"> PAGEREF _Toc220769243 \h </w:instrText>
         </w:r>
         <w:r>
           <w:rPr>
@@ -2505,7 +2511,7 @@
           <w:lang w:eastAsia="de-DE"/>
         </w:rPr>
       </w:pPr>
-      <w:hyperlink w:anchor="_Toc213070219" w:history="1">
+      <w:hyperlink w:anchor="_Toc220769244" w:history="1">
         <w:r>
           <w:rPr>
             <w:rStyle w:val="Hyperlink"/>
@@ -2532,7 +2538,7 @@
             <w:noProof/>
             <w:webHidden/>
           </w:rPr>
-          <w:instrText xml:space="preserve"> PAGEREF _Toc213070219 \h </w:instrText>
+          <w:instrText xml:space="preserve"> PAGEREF _Toc220769244 \h </w:instrText>
         </w:r>
         <w:r>
           <w:rPr>
@@ -2577,7 +2583,7 @@
           <w:lang w:eastAsia="de-DE"/>
         </w:rPr>
       </w:pPr>
-      <w:hyperlink w:anchor="_Toc213070220" w:history="1">
+      <w:hyperlink w:anchor="_Toc220769245" w:history="1">
         <w:r>
           <w:rPr>
             <w:rStyle w:val="Hyperlink"/>
@@ -2604,7 +2610,7 @@
             <w:noProof/>
             <w:webHidden/>
           </w:rPr>
-          <w:instrText xml:space="preserve"> PAGEREF _Toc213070220 \h </w:instrText>
+          <w:instrText xml:space="preserve"> PAGEREF _Toc220769245 \h </w:instrText>
         </w:r>
         <w:r>
           <w:rPr>
@@ -2649,7 +2655,7 @@
           <w:lang w:eastAsia="de-DE"/>
         </w:rPr>
       </w:pPr>
-      <w:hyperlink w:anchor="_Toc213070221" w:history="1">
+      <w:hyperlink w:anchor="_Toc220769246" w:history="1">
         <w:r>
           <w:rPr>
             <w:rStyle w:val="Hyperlink"/>
@@ -2676,7 +2682,7 @@
             <w:noProof/>
             <w:webHidden/>
           </w:rPr>
-          <w:instrText xml:space="preserve"> PAGEREF _Toc213070221 \h </w:instrText>
+          <w:instrText xml:space="preserve"> PAGEREF _Toc220769246 \h </w:instrText>
         </w:r>
         <w:r>
           <w:rPr>
@@ -2729,7 +2735,7 @@
       <w:pPr>
         <w:pStyle w:val="berschrift1"/>
       </w:pPr>
-      <w:bookmarkStart w:id="47" w:name="_Toc213070188"/>
+      <w:bookmarkStart w:id="50" w:name="_Toc220769213"/>
       <w:r>
         <w:lastRenderedPageBreak/>
         <w:t xml:space="preserve">Programmzeilen </w:t>
@@ -2742,7 +2748,7 @@
       </w:r>
       <w:bookmarkEnd w:id="0"/>
       <w:bookmarkEnd w:id="1"/>
-      <w:bookmarkEnd w:id="47"/>
+      <w:bookmarkEnd w:id="50"/>
     </w:p>
     <w:p>
       <w:r>
@@ -2770,8 +2776,8 @@
           <w:color w:val="auto"/>
         </w:rPr>
       </w:pPr>
-      <w:bookmarkStart w:id="48" w:name="_Toc196339504"/>
-      <w:bookmarkStart w:id="49" w:name="_Toc196339873"/>
+      <w:bookmarkStart w:id="51" w:name="_Toc196339504"/>
+      <w:bookmarkStart w:id="52" w:name="_Toc196339873"/>
       <w:r>
         <w:t>Zeichenketten (</w:t>
       </w:r>
@@ -2783,8 +2789,8 @@
       <w:r>
         <w:t>) testen</w:t>
       </w:r>
-      <w:bookmarkEnd w:id="48"/>
-      <w:bookmarkEnd w:id="49"/>
+      <w:bookmarkEnd w:id="51"/>
+      <w:bookmarkEnd w:id="52"/>
     </w:p>
     <w:tbl>
       <w:tblPr>
@@ -3102,8 +3108,8 @@
       <w:pPr>
         <w:pStyle w:val="berschrift3"/>
       </w:pPr>
-      <w:bookmarkStart w:id="50" w:name="_Toc196339505"/>
-      <w:bookmarkStart w:id="51" w:name="_Toc196339874"/>
+      <w:bookmarkStart w:id="53" w:name="_Toc196339505"/>
+      <w:bookmarkStart w:id="54" w:name="_Toc196339874"/>
       <w:r>
         <w:t>Zeichenketten in Variable</w:t>
       </w:r>
@@ -3113,8 +3119,8 @@
       <w:r>
         <w:t xml:space="preserve"> schreiben</w:t>
       </w:r>
-      <w:bookmarkEnd w:id="50"/>
-      <w:bookmarkEnd w:id="51"/>
+      <w:bookmarkEnd w:id="53"/>
+      <w:bookmarkEnd w:id="54"/>
     </w:p>
     <w:tbl>
       <w:tblPr>
@@ -3545,8 +3551,8 @@
       <w:pPr>
         <w:pStyle w:val="berschrift3"/>
       </w:pPr>
-      <w:bookmarkStart w:id="52" w:name="_Toc196339506"/>
-      <w:bookmarkStart w:id="53" w:name="_Toc196339875"/>
+      <w:bookmarkStart w:id="55" w:name="_Toc196339506"/>
+      <w:bookmarkStart w:id="56" w:name="_Toc196339875"/>
       <w:r>
         <w:t xml:space="preserve">Zahlen (integer und </w:t>
       </w:r>
@@ -3558,8 +3564,8 @@
       <w:r>
         <w:t>) testen</w:t>
       </w:r>
-      <w:bookmarkEnd w:id="52"/>
-      <w:bookmarkEnd w:id="53"/>
+      <w:bookmarkEnd w:id="55"/>
+      <w:bookmarkEnd w:id="56"/>
     </w:p>
     <w:tbl>
       <w:tblPr>
@@ -3881,13 +3887,13 @@
       <w:pPr>
         <w:pStyle w:val="berschrift3"/>
       </w:pPr>
-      <w:bookmarkStart w:id="54" w:name="_Toc196339507"/>
-      <w:bookmarkStart w:id="55" w:name="_Toc196339876"/>
+      <w:bookmarkStart w:id="57" w:name="_Toc196339507"/>
+      <w:bookmarkStart w:id="58" w:name="_Toc196339876"/>
       <w:r>
         <w:t>Zahlen in Variablen schreiben</w:t>
       </w:r>
-      <w:bookmarkEnd w:id="54"/>
-      <w:bookmarkEnd w:id="55"/>
+      <w:bookmarkEnd w:id="57"/>
+      <w:bookmarkEnd w:id="58"/>
     </w:p>
     <w:tbl>
       <w:tblPr>
@@ -4219,15 +4225,15 @@
       <w:pPr>
         <w:pStyle w:val="berschrift3"/>
       </w:pPr>
-      <w:bookmarkStart w:id="56" w:name="_Hlk196246348"/>
-      <w:bookmarkStart w:id="57" w:name="_Toc196339508"/>
-      <w:bookmarkStart w:id="58" w:name="_Toc196339877"/>
+      <w:bookmarkStart w:id="59" w:name="_Hlk196246348"/>
+      <w:bookmarkStart w:id="60" w:name="_Toc196339508"/>
+      <w:bookmarkStart w:id="61" w:name="_Toc196339877"/>
       <w:r>
         <w:t>Die Farbe kennzeichnet einen Text mit besonderer Bedeutung</w:t>
       </w:r>
-      <w:bookmarkEnd w:id="56"/>
-      <w:bookmarkEnd w:id="57"/>
-      <w:bookmarkEnd w:id="58"/>
+      <w:bookmarkEnd w:id="59"/>
+      <w:bookmarkEnd w:id="60"/>
+      <w:bookmarkEnd w:id="61"/>
     </w:p>
     <w:tbl>
       <w:tblPr>
@@ -4370,16 +4376,16 @@
       <w:pPr>
         <w:pStyle w:val="berschrift1"/>
       </w:pPr>
-      <w:bookmarkStart w:id="59" w:name="_Toc196339509"/>
-      <w:bookmarkStart w:id="60" w:name="_Toc196339878"/>
-      <w:bookmarkStart w:id="61" w:name="_Toc213070189"/>
+      <w:bookmarkStart w:id="62" w:name="_Toc196339509"/>
+      <w:bookmarkStart w:id="63" w:name="_Toc196339878"/>
+      <w:bookmarkStart w:id="64" w:name="_Toc220769214"/>
       <w:r>
         <w:lastRenderedPageBreak/>
         <w:t>Mit der IDLE Shell rechnen</w:t>
       </w:r>
-      <w:bookmarkEnd w:id="59"/>
-      <w:bookmarkEnd w:id="60"/>
-      <w:bookmarkEnd w:id="61"/>
+      <w:bookmarkEnd w:id="62"/>
+      <w:bookmarkEnd w:id="63"/>
+      <w:bookmarkEnd w:id="64"/>
     </w:p>
     <w:p>
       <w:r>
@@ -4399,13 +4405,13 @@
       <w:pPr>
         <w:pStyle w:val="berschrift3"/>
       </w:pPr>
-      <w:bookmarkStart w:id="62" w:name="_Toc196339510"/>
-      <w:bookmarkStart w:id="63" w:name="_Toc196339879"/>
+      <w:bookmarkStart w:id="65" w:name="_Toc196339510"/>
+      <w:bookmarkStart w:id="66" w:name="_Toc196339879"/>
       <w:r>
         <w:t>Rechnen mit Zeichenketten</w:t>
       </w:r>
-      <w:bookmarkEnd w:id="62"/>
-      <w:bookmarkEnd w:id="63"/>
+      <w:bookmarkEnd w:id="65"/>
+      <w:bookmarkEnd w:id="66"/>
     </w:p>
     <w:tbl>
       <w:tblPr>
@@ -4969,13 +4975,13 @@
       <w:pPr>
         <w:pStyle w:val="berschrift3"/>
       </w:pPr>
-      <w:bookmarkStart w:id="64" w:name="_Toc196339511"/>
-      <w:bookmarkStart w:id="65" w:name="_Toc196339880"/>
+      <w:bookmarkStart w:id="67" w:name="_Toc196339511"/>
+      <w:bookmarkStart w:id="68" w:name="_Toc196339880"/>
       <w:r>
         <w:t>Rechnen mit Zahlen</w:t>
       </w:r>
-      <w:bookmarkEnd w:id="64"/>
-      <w:bookmarkEnd w:id="65"/>
+      <w:bookmarkEnd w:id="67"/>
+      <w:bookmarkEnd w:id="68"/>
     </w:p>
     <w:tbl>
       <w:tblPr>
@@ -5465,13 +5471,13 @@
       <w:pPr>
         <w:pStyle w:val="berschrift3"/>
       </w:pPr>
-      <w:bookmarkStart w:id="66" w:name="_Toc196339512"/>
-      <w:bookmarkStart w:id="67" w:name="_Toc196339881"/>
+      <w:bookmarkStart w:id="69" w:name="_Toc196339512"/>
+      <w:bookmarkStart w:id="70" w:name="_Toc196339881"/>
       <w:r>
         <w:t>Punktrechnung vor Strichrechnung</w:t>
       </w:r>
-      <w:bookmarkEnd w:id="66"/>
-      <w:bookmarkEnd w:id="67"/>
+      <w:bookmarkEnd w:id="69"/>
+      <w:bookmarkEnd w:id="70"/>
     </w:p>
     <w:tbl>
       <w:tblPr>
@@ -5745,16 +5751,16 @@
       <w:pPr>
         <w:pStyle w:val="berschrift3"/>
       </w:pPr>
-      <w:bookmarkStart w:id="68" w:name="_Toc196339513"/>
-      <w:bookmarkStart w:id="69" w:name="_Toc196339882"/>
+      <w:bookmarkStart w:id="71" w:name="_Toc196339513"/>
+      <w:bookmarkStart w:id="72" w:name="_Toc196339882"/>
       <w:r>
         <w:t>Zahl in Zeichenkette umwandeln</w:t>
       </w:r>
       <w:r>
         <w:t xml:space="preserve"> – Zeichenkette in Zahl umwandeln</w:t>
       </w:r>
-      <w:bookmarkEnd w:id="68"/>
-      <w:bookmarkEnd w:id="69"/>
+      <w:bookmarkEnd w:id="71"/>
+      <w:bookmarkEnd w:id="72"/>
     </w:p>
     <w:tbl>
       <w:tblPr>
@@ -6093,9 +6099,9 @@
       <w:pPr>
         <w:pStyle w:val="berschrift1"/>
       </w:pPr>
-      <w:bookmarkStart w:id="70" w:name="_Toc196339514"/>
-      <w:bookmarkStart w:id="71" w:name="_Toc196339883"/>
-      <w:bookmarkStart w:id="72" w:name="_Toc213070190"/>
+      <w:bookmarkStart w:id="73" w:name="_Toc196339514"/>
+      <w:bookmarkStart w:id="74" w:name="_Toc196339883"/>
+      <w:bookmarkStart w:id="75" w:name="_Toc220769215"/>
       <w:r>
         <w:lastRenderedPageBreak/>
         <w:t>M</w:t>
@@ -6117,9 +6123,9 @@
       <w:r>
         <w:t>schreiben</w:t>
       </w:r>
-      <w:bookmarkEnd w:id="70"/>
-      <w:bookmarkEnd w:id="71"/>
-      <w:bookmarkEnd w:id="72"/>
+      <w:bookmarkEnd w:id="73"/>
+      <w:bookmarkEnd w:id="74"/>
+      <w:bookmarkEnd w:id="75"/>
     </w:p>
     <w:p>
       <w:r>
@@ -6220,13 +6226,13 @@
       <w:pPr>
         <w:pStyle w:val="berschrift3"/>
       </w:pPr>
-      <w:bookmarkStart w:id="73" w:name="_Toc196339515"/>
-      <w:bookmarkStart w:id="74" w:name="_Toc196339884"/>
+      <w:bookmarkStart w:id="76" w:name="_Toc196339515"/>
+      <w:bookmarkStart w:id="77" w:name="_Toc196339884"/>
       <w:r>
         <w:t>Rechnen</w:t>
       </w:r>
-      <w:bookmarkEnd w:id="73"/>
-      <w:bookmarkEnd w:id="74"/>
+      <w:bookmarkEnd w:id="76"/>
+      <w:bookmarkEnd w:id="77"/>
     </w:p>
     <w:tbl>
       <w:tblPr>
@@ -6479,13 +6485,13 @@
       <w:pPr>
         <w:pStyle w:val="berschrift3"/>
       </w:pPr>
-      <w:bookmarkStart w:id="75" w:name="_Toc196339516"/>
-      <w:bookmarkStart w:id="76" w:name="_Toc196339885"/>
+      <w:bookmarkStart w:id="78" w:name="_Toc196339516"/>
+      <w:bookmarkStart w:id="79" w:name="_Toc196339885"/>
       <w:r>
         <w:t>Umwandeln</w:t>
       </w:r>
-      <w:bookmarkEnd w:id="75"/>
-      <w:bookmarkEnd w:id="76"/>
+      <w:bookmarkEnd w:id="78"/>
+      <w:bookmarkEnd w:id="79"/>
     </w:p>
     <w:tbl>
       <w:tblPr>
@@ -6836,13 +6842,13 @@
       <w:pPr>
         <w:pStyle w:val="berschrift3"/>
       </w:pPr>
-      <w:bookmarkStart w:id="77" w:name="_Toc196339517"/>
-      <w:bookmarkStart w:id="78" w:name="_Toc196339886"/>
+      <w:bookmarkStart w:id="80" w:name="_Toc196339517"/>
+      <w:bookmarkStart w:id="81" w:name="_Toc196339886"/>
       <w:r>
         <w:t>Variablen ausgeben</w:t>
       </w:r>
-      <w:bookmarkEnd w:id="77"/>
-      <w:bookmarkEnd w:id="78"/>
+      <w:bookmarkEnd w:id="80"/>
+      <w:bookmarkEnd w:id="81"/>
     </w:p>
     <w:tbl>
       <w:tblPr>
@@ -7157,9 +7163,9 @@
       <w:pPr>
         <w:pStyle w:val="berschrift1"/>
       </w:pPr>
-      <w:bookmarkStart w:id="79" w:name="_Toc196339518"/>
-      <w:bookmarkStart w:id="80" w:name="_Toc196339887"/>
-      <w:bookmarkStart w:id="81" w:name="_Toc213070191"/>
+      <w:bookmarkStart w:id="82" w:name="_Toc196339518"/>
+      <w:bookmarkStart w:id="83" w:name="_Toc196339887"/>
+      <w:bookmarkStart w:id="84" w:name="_Toc220769216"/>
       <w:r>
         <w:lastRenderedPageBreak/>
         <w:t xml:space="preserve">Aufgabe: </w:t>
@@ -7167,9 +7173,9 @@
       <w:r>
         <w:t>Ziffern mit Punkten darstellen</w:t>
       </w:r>
-      <w:bookmarkEnd w:id="79"/>
-      <w:bookmarkEnd w:id="80"/>
-      <w:bookmarkEnd w:id="81"/>
+      <w:bookmarkEnd w:id="82"/>
+      <w:bookmarkEnd w:id="83"/>
+      <w:bookmarkEnd w:id="84"/>
     </w:p>
     <w:p>
       <w:r>
@@ -7632,9 +7638,9 @@
       <w:pPr>
         <w:pStyle w:val="berschrift1"/>
       </w:pPr>
-      <w:bookmarkStart w:id="82" w:name="_Toc196339519"/>
-      <w:bookmarkStart w:id="83" w:name="_Toc196339888"/>
-      <w:bookmarkStart w:id="84" w:name="_Toc213070192"/>
+      <w:bookmarkStart w:id="85" w:name="_Toc196339519"/>
+      <w:bookmarkStart w:id="86" w:name="_Toc196339888"/>
+      <w:bookmarkStart w:id="87" w:name="_Toc220769217"/>
       <w:r>
         <w:lastRenderedPageBreak/>
         <w:t>E</w:t>
@@ -7654,9 +7660,9 @@
       <w:r>
         <w:t>Elemente</w:t>
       </w:r>
-      <w:bookmarkEnd w:id="82"/>
-      <w:bookmarkEnd w:id="83"/>
-      <w:bookmarkEnd w:id="84"/>
+      <w:bookmarkEnd w:id="85"/>
+      <w:bookmarkEnd w:id="86"/>
+      <w:bookmarkEnd w:id="87"/>
     </w:p>
     <w:p>
       <w:r>
@@ -7684,8 +7690,8 @@
       </w:r>
     </w:p>
     <w:p>
-      <w:bookmarkStart w:id="85" w:name="_Toc196339520"/>
-      <w:bookmarkStart w:id="86" w:name="_Toc196339889"/>
+      <w:bookmarkStart w:id="88" w:name="_Toc196339520"/>
+      <w:bookmarkStart w:id="89" w:name="_Toc196339889"/>
       <w:r>
         <w:t xml:space="preserve">Notiere die print-Ausgaben in der Tabelle.  </w:t>
       </w:r>
@@ -7706,8 +7712,8 @@
       <w:r>
         <w:t>legen – mit eckigen Klammern!</w:t>
       </w:r>
-      <w:bookmarkEnd w:id="85"/>
-      <w:bookmarkEnd w:id="86"/>
+      <w:bookmarkEnd w:id="88"/>
+      <w:bookmarkEnd w:id="89"/>
     </w:p>
     <w:tbl>
       <w:tblPr>
@@ -8118,13 +8124,13 @@
       <w:pPr>
         <w:pStyle w:val="berschrift3"/>
       </w:pPr>
-      <w:bookmarkStart w:id="87" w:name="_Toc196339521"/>
-      <w:bookmarkStart w:id="88" w:name="_Toc196339890"/>
+      <w:bookmarkStart w:id="90" w:name="_Toc196339521"/>
+      <w:bookmarkStart w:id="91" w:name="_Toc196339890"/>
       <w:r>
         <w:t>Eine Liste erweitern</w:t>
       </w:r>
-      <w:bookmarkEnd w:id="87"/>
-      <w:bookmarkEnd w:id="88"/>
+      <w:bookmarkEnd w:id="90"/>
+      <w:bookmarkEnd w:id="91"/>
     </w:p>
     <w:tbl>
       <w:tblPr>
@@ -8379,13 +8385,13 @@
       <w:pPr>
         <w:pStyle w:val="berschrift3"/>
       </w:pPr>
-      <w:bookmarkStart w:id="89" w:name="_Toc196339522"/>
-      <w:bookmarkStart w:id="90" w:name="_Toc196339891"/>
+      <w:bookmarkStart w:id="92" w:name="_Toc196339522"/>
+      <w:bookmarkStart w:id="93" w:name="_Toc196339891"/>
       <w:r>
         <w:t>Eine leere Liste anlegen und füllen</w:t>
       </w:r>
-      <w:bookmarkEnd w:id="89"/>
-      <w:bookmarkEnd w:id="90"/>
+      <w:bookmarkEnd w:id="92"/>
+      <w:bookmarkEnd w:id="93"/>
     </w:p>
     <w:tbl>
       <w:tblPr>
@@ -8646,13 +8652,13 @@
       <w:pPr>
         <w:pStyle w:val="berschrift3"/>
       </w:pPr>
-      <w:bookmarkStart w:id="91" w:name="_Toc196339523"/>
-      <w:bookmarkStart w:id="92" w:name="_Toc196339892"/>
+      <w:bookmarkStart w:id="94" w:name="_Toc196339523"/>
+      <w:bookmarkStart w:id="95" w:name="_Toc196339892"/>
       <w:r>
         <w:t>Elemente einer Liste löschen</w:t>
       </w:r>
-      <w:bookmarkEnd w:id="91"/>
-      <w:bookmarkEnd w:id="92"/>
+      <w:bookmarkEnd w:id="94"/>
+      <w:bookmarkEnd w:id="95"/>
     </w:p>
     <w:tbl>
       <w:tblPr>
@@ -9021,13 +9027,13 @@
       <w:pPr>
         <w:pStyle w:val="berschrift3"/>
       </w:pPr>
-      <w:bookmarkStart w:id="93" w:name="_Toc196339524"/>
-      <w:bookmarkStart w:id="94" w:name="_Toc196339893"/>
+      <w:bookmarkStart w:id="96" w:name="_Toc196339524"/>
+      <w:bookmarkStart w:id="97" w:name="_Toc196339893"/>
       <w:r>
         <w:t>Ein zufälliges Element aus einer Liste auswählen</w:t>
       </w:r>
-      <w:bookmarkEnd w:id="93"/>
-      <w:bookmarkEnd w:id="94"/>
+      <w:bookmarkEnd w:id="96"/>
+      <w:bookmarkEnd w:id="97"/>
     </w:p>
     <w:tbl>
       <w:tblPr>
@@ -9228,9 +9234,9 @@
       <w:pPr>
         <w:pStyle w:val="berschrift1"/>
       </w:pPr>
-      <w:bookmarkStart w:id="95" w:name="_Toc196339525"/>
-      <w:bookmarkStart w:id="96" w:name="_Toc196339894"/>
-      <w:bookmarkStart w:id="97" w:name="_Toc213070193"/>
+      <w:bookmarkStart w:id="98" w:name="_Toc196339525"/>
+      <w:bookmarkStart w:id="99" w:name="_Toc196339894"/>
+      <w:bookmarkStart w:id="100" w:name="_Toc220769218"/>
       <w:r>
         <w:lastRenderedPageBreak/>
         <w:t xml:space="preserve">Ein </w:t>
@@ -9253,9 +9259,9 @@
       <w:r>
         <w:t>Elemente</w:t>
       </w:r>
-      <w:bookmarkEnd w:id="95"/>
-      <w:bookmarkEnd w:id="96"/>
-      <w:bookmarkEnd w:id="97"/>
+      <w:bookmarkEnd w:id="98"/>
+      <w:bookmarkEnd w:id="99"/>
+      <w:bookmarkEnd w:id="100"/>
     </w:p>
     <w:p>
       <w:r>
@@ -9274,8 +9280,8 @@
       </w:r>
     </w:p>
     <w:p>
-      <w:bookmarkStart w:id="98" w:name="_Toc196339526"/>
-      <w:bookmarkStart w:id="99" w:name="_Toc196339895"/>
+      <w:bookmarkStart w:id="101" w:name="_Toc196339526"/>
+      <w:bookmarkStart w:id="102" w:name="_Toc196339895"/>
       <w:r>
         <w:t xml:space="preserve">Notiere die print-Ausgaben in der Tabelle.  </w:t>
       </w:r>
@@ -9296,8 +9302,8 @@
       <w:r>
         <w:t>legen – mit runden Klammern!</w:t>
       </w:r>
-      <w:bookmarkEnd w:id="98"/>
-      <w:bookmarkEnd w:id="99"/>
+      <w:bookmarkEnd w:id="101"/>
+      <w:bookmarkEnd w:id="102"/>
     </w:p>
     <w:tbl>
       <w:tblPr>
@@ -9654,13 +9660,13 @@
       <w:pPr>
         <w:pStyle w:val="berschrift3"/>
       </w:pPr>
-      <w:bookmarkStart w:id="100" w:name="_Toc196339527"/>
-      <w:bookmarkStart w:id="101" w:name="_Toc196339896"/>
+      <w:bookmarkStart w:id="103" w:name="_Toc196339527"/>
+      <w:bookmarkStart w:id="104" w:name="_Toc196339896"/>
       <w:r>
         <w:t>Ein Element im Tupel suchen</w:t>
       </w:r>
-      <w:bookmarkEnd w:id="100"/>
-      <w:bookmarkEnd w:id="101"/>
+      <w:bookmarkEnd w:id="103"/>
+      <w:bookmarkEnd w:id="104"/>
     </w:p>
     <w:tbl>
       <w:tblPr>
@@ -9859,12 +9865,12 @@
       <w:pPr>
         <w:pStyle w:val="berschrift1"/>
       </w:pPr>
-      <w:bookmarkStart w:id="102" w:name="_Toc213070194"/>
+      <w:bookmarkStart w:id="105" w:name="_Toc220769219"/>
       <w:r>
         <w:lastRenderedPageBreak/>
         <w:t>Ein Dictionary speichert Paare von Schlüssel und Wert</w:t>
       </w:r>
-      <w:bookmarkEnd w:id="102"/>
+      <w:bookmarkEnd w:id="105"/>
     </w:p>
     <w:p>
       <w:r>
@@ -11159,12 +11165,12 @@
       <w:pPr>
         <w:pStyle w:val="berschrift1"/>
       </w:pPr>
-      <w:bookmarkStart w:id="103" w:name="_Toc213070195"/>
+      <w:bookmarkStart w:id="106" w:name="_Toc220769220"/>
       <w:r>
         <w:lastRenderedPageBreak/>
         <w:t>Der Computer fragt …</w:t>
       </w:r>
-      <w:bookmarkEnd w:id="103"/>
+      <w:bookmarkEnd w:id="106"/>
     </w:p>
     <w:p>
       <w:r>
@@ -12228,12 +12234,12 @@
       <w:pPr>
         <w:pStyle w:val="berschrift1"/>
       </w:pPr>
-      <w:bookmarkStart w:id="104" w:name="_Toc213070196"/>
+      <w:bookmarkStart w:id="107" w:name="_Toc220769221"/>
       <w:r>
         <w:lastRenderedPageBreak/>
         <w:t>Der Computer unterscheidet zwischen "wahr" und "falsch"</w:t>
       </w:r>
-      <w:bookmarkEnd w:id="104"/>
+      <w:bookmarkEnd w:id="107"/>
     </w:p>
     <w:p>
       <w:r>
@@ -13947,12 +13953,12 @@
       <w:pPr>
         <w:pStyle w:val="berschrift1"/>
       </w:pPr>
-      <w:bookmarkStart w:id="105" w:name="_Toc213070197"/>
+      <w:bookmarkStart w:id="108" w:name="_Toc220769222"/>
       <w:r>
         <w:lastRenderedPageBreak/>
         <w:t>Der Computer unterscheidet Fälle</w:t>
       </w:r>
-      <w:bookmarkEnd w:id="105"/>
+      <w:bookmarkEnd w:id="108"/>
     </w:p>
     <w:p>
       <w:pPr>
@@ -14956,12 +14962,12 @@
       <w:pPr>
         <w:pStyle w:val="berschrift1"/>
       </w:pPr>
-      <w:bookmarkStart w:id="106" w:name="_Toc213070198"/>
+      <w:bookmarkStart w:id="109" w:name="_Toc220769223"/>
       <w:r>
         <w:lastRenderedPageBreak/>
         <w:t>Der Computer dreht Schleifen</w:t>
       </w:r>
-      <w:bookmarkEnd w:id="106"/>
+      <w:bookmarkEnd w:id="109"/>
     </w:p>
     <w:p>
       <w:pPr>
@@ -16580,7 +16586,7 @@
       <w:pPr>
         <w:pStyle w:val="berschrift1"/>
       </w:pPr>
-      <w:bookmarkStart w:id="107" w:name="_Toc213070199"/>
+      <w:bookmarkStart w:id="110" w:name="_Toc220769224"/>
       <w:r>
         <w:lastRenderedPageBreak/>
         <w:t xml:space="preserve">Aufgabe: </w:t>
@@ -16588,7 +16594,7 @@
       <w:r>
         <w:t>Dialog mit dem Benutzer</w:t>
       </w:r>
-      <w:bookmarkEnd w:id="107"/>
+      <w:bookmarkEnd w:id="110"/>
     </w:p>
     <w:p>
       <w:pPr>
@@ -16955,7 +16961,7 @@
       <w:pPr>
         <w:pStyle w:val="berschrift1"/>
       </w:pPr>
-      <w:bookmarkStart w:id="108" w:name="_Toc213070200"/>
+      <w:bookmarkStart w:id="111" w:name="_Toc220769225"/>
       <w:r>
         <w:lastRenderedPageBreak/>
         <w:t xml:space="preserve">Funktionen </w:t>
@@ -16966,7 +16972,7 @@
       <w:r>
         <w:t>: Ganzzahlen</w:t>
       </w:r>
-      <w:bookmarkEnd w:id="108"/>
+      <w:bookmarkEnd w:id="111"/>
       <w:r>
         <w:t xml:space="preserve"> </w:t>
       </w:r>
@@ -18412,7 +18418,7 @@
       <w:pPr>
         <w:pStyle w:val="berschrift1"/>
       </w:pPr>
-      <w:bookmarkStart w:id="109" w:name="_Toc213070201"/>
+      <w:bookmarkStart w:id="112" w:name="_Toc220769226"/>
       <w:r>
         <w:lastRenderedPageBreak/>
         <w:t xml:space="preserve">Funktionen </w:t>
@@ -18423,7 +18429,7 @@
       <w:r>
         <w:t>: Tupel, Liste</w:t>
       </w:r>
-      <w:bookmarkEnd w:id="109"/>
+      <w:bookmarkEnd w:id="112"/>
       <w:r>
         <w:t xml:space="preserve">  </w:t>
       </w:r>
@@ -19687,12 +19693,12 @@
       <w:pPr>
         <w:pStyle w:val="berschrift1"/>
       </w:pPr>
-      <w:bookmarkStart w:id="110" w:name="_Toc213070202"/>
+      <w:bookmarkStart w:id="113" w:name="_Toc220769227"/>
       <w:r>
         <w:lastRenderedPageBreak/>
         <w:t>Globale und lokale Variable in der Funktion</w:t>
       </w:r>
-      <w:bookmarkEnd w:id="110"/>
+      <w:bookmarkEnd w:id="113"/>
     </w:p>
     <w:p>
       <w:pPr>
@@ -19968,7 +19974,7 @@
       <w:pPr>
         <w:pStyle w:val="berschrift1"/>
       </w:pPr>
-      <w:bookmarkStart w:id="111" w:name="_Toc213070203"/>
+      <w:bookmarkStart w:id="114" w:name="_Toc220769228"/>
       <w:r>
         <w:lastRenderedPageBreak/>
         <w:t>Aufgaben mit Funktionen lösen</w:t>
@@ -19976,7 +19982,7 @@
       <w:r>
         <w:t>: Konstruktionsanleitung</w:t>
       </w:r>
-      <w:bookmarkEnd w:id="111"/>
+      <w:bookmarkEnd w:id="114"/>
     </w:p>
     <w:p>
       <w:pPr>
@@ -21591,7 +21597,7 @@
       <w:pPr>
         <w:pStyle w:val="berschrift1"/>
       </w:pPr>
-      <w:bookmarkStart w:id="112" w:name="_Toc213070204"/>
+      <w:bookmarkStart w:id="115" w:name="_Toc220769229"/>
       <w:r>
         <w:lastRenderedPageBreak/>
         <w:t>Aufgaben mit Funktionen lösen</w:t>
@@ -21599,7 +21605,7 @@
       <w:r>
         <w:t>: Tabelle drucken</w:t>
       </w:r>
-      <w:bookmarkEnd w:id="112"/>
+      <w:bookmarkEnd w:id="115"/>
       <w:r>
         <w:t xml:space="preserve"> </w:t>
       </w:r>
@@ -22741,7 +22747,7 @@
       <w:pPr>
         <w:pStyle w:val="berschrift1"/>
       </w:pPr>
-      <w:bookmarkStart w:id="113" w:name="_Toc213070205"/>
+      <w:bookmarkStart w:id="116" w:name="_Toc220769230"/>
       <w:r>
         <w:lastRenderedPageBreak/>
         <w:t>Aufgaben mit Funktionen lösen</w:t>
@@ -22749,7 +22755,7 @@
       <w:r>
         <w:t>: Diagramm plotten</w:t>
       </w:r>
-      <w:bookmarkEnd w:id="113"/>
+      <w:bookmarkEnd w:id="116"/>
       <w:r>
         <w:t xml:space="preserve">  </w:t>
       </w:r>
@@ -24448,12 +24454,12 @@
       <w:pPr>
         <w:pStyle w:val="berschrift1"/>
       </w:pPr>
-      <w:bookmarkStart w:id="114" w:name="_Toc213070206"/>
+      <w:bookmarkStart w:id="117" w:name="_Toc220769231"/>
       <w:r>
         <w:lastRenderedPageBreak/>
         <w:t>Klassen haben Eigenschaften und Methoden</w:t>
       </w:r>
-      <w:bookmarkEnd w:id="114"/>
+      <w:bookmarkEnd w:id="117"/>
     </w:p>
     <w:p>
       <w:pPr>
@@ -25846,12 +25852,12 @@
       <w:pPr>
         <w:pStyle w:val="berschrift1"/>
       </w:pPr>
-      <w:bookmarkStart w:id="115" w:name="_Toc213070207"/>
+      <w:bookmarkStart w:id="118" w:name="_Toc220769232"/>
       <w:r>
         <w:lastRenderedPageBreak/>
         <w:t>Die Eltern-Klasse vererbt – die Kind-Klasse erbt</w:t>
       </w:r>
-      <w:bookmarkEnd w:id="115"/>
+      <w:bookmarkEnd w:id="118"/>
     </w:p>
     <w:p>
       <w:pPr>
@@ -28732,12 +28738,12 @@
       <w:pPr>
         <w:pStyle w:val="berschrift1"/>
       </w:pPr>
-      <w:bookmarkStart w:id="116" w:name="_Toc213070208"/>
+      <w:bookmarkStart w:id="119" w:name="_Toc220769233"/>
       <w:r>
         <w:lastRenderedPageBreak/>
         <w:t>Roboter im Irrgarten: Wände bauen</w:t>
       </w:r>
-      <w:bookmarkEnd w:id="116"/>
+      <w:bookmarkEnd w:id="119"/>
     </w:p>
     <w:p>
       <w:pPr>
@@ -28944,7 +28950,7 @@
         <w:pStyle w:val="berschrift1"/>
         <w:spacing w:before="0" w:after="0"/>
       </w:pPr>
-      <w:bookmarkStart w:id="117" w:name="_Toc213070209"/>
+      <w:bookmarkStart w:id="120" w:name="_Toc220769234"/>
       <w:r>
         <w:lastRenderedPageBreak/>
         <w:t xml:space="preserve">Roboter </w:t>
@@ -28952,7 +28958,7 @@
       <w:r>
         <w:t>im Irrgarten: Wände ablegen</w:t>
       </w:r>
-      <w:bookmarkEnd w:id="117"/>
+      <w:bookmarkEnd w:id="120"/>
     </w:p>
     <w:p>
       <w:pPr>
@@ -29293,7 +29299,7 @@
       <w:pPr>
         <w:pStyle w:val="berschrift1"/>
       </w:pPr>
-      <w:bookmarkStart w:id="118" w:name="_Toc213070210"/>
+      <w:bookmarkStart w:id="121" w:name="_Toc220769235"/>
       <w:r>
         <w:lastRenderedPageBreak/>
         <w:t xml:space="preserve">Roboter </w:t>
@@ -29307,7 +29313,7 @@
       <w:r>
         <w:t>: Wände aus Datei lesen</w:t>
       </w:r>
-      <w:bookmarkEnd w:id="118"/>
+      <w:bookmarkEnd w:id="121"/>
     </w:p>
     <w:p>
       <w:pPr>
@@ -29812,7 +29818,7 @@
       <w:pPr>
         <w:pStyle w:val="berschrift1"/>
       </w:pPr>
-      <w:bookmarkStart w:id="119" w:name="_Toc213070211"/>
+      <w:bookmarkStart w:id="122" w:name="_Toc220769236"/>
       <w:r>
         <w:lastRenderedPageBreak/>
         <w:t xml:space="preserve">Roboter </w:t>
@@ -29826,7 +29832,7 @@
       <w:r>
         <w:t>: Schildkröte bewegen</w:t>
       </w:r>
-      <w:bookmarkEnd w:id="119"/>
+      <w:bookmarkEnd w:id="122"/>
     </w:p>
     <w:p>
       <w:pPr>
@@ -30180,7 +30186,7 @@
       <w:pPr>
         <w:pStyle w:val="berschrift1"/>
       </w:pPr>
-      <w:bookmarkStart w:id="120" w:name="_Toc213070212"/>
+      <w:bookmarkStart w:id="123" w:name="_Toc220769237"/>
       <w:r>
         <w:lastRenderedPageBreak/>
         <w:t xml:space="preserve">Roboter </w:t>
@@ -30188,7 +30194,7 @@
       <w:r>
         <w:t>im Irrgarten: Schauen, gehen, drehen</w:t>
       </w:r>
-      <w:bookmarkEnd w:id="120"/>
+      <w:bookmarkEnd w:id="123"/>
     </w:p>
     <w:p>
       <w:pPr>
@@ -31057,7 +31063,7 @@
       <w:pPr>
         <w:pStyle w:val="berschrift1"/>
       </w:pPr>
-      <w:bookmarkStart w:id="121" w:name="_Toc213070213"/>
+      <w:bookmarkStart w:id="124" w:name="_Toc220769238"/>
       <w:r>
         <w:lastRenderedPageBreak/>
         <w:t xml:space="preserve">Roboter </w:t>
@@ -31071,7 +31077,7 @@
       <w:r>
         <w:t>: Rechte-Hand-Methode</w:t>
       </w:r>
-      <w:bookmarkEnd w:id="121"/>
+      <w:bookmarkEnd w:id="124"/>
     </w:p>
     <w:p>
       <w:pPr>
@@ -31414,7 +31420,7 @@
       <w:pPr>
         <w:pStyle w:val="berschrift1"/>
       </w:pPr>
-      <w:bookmarkStart w:id="122" w:name="_Toc213070214"/>
+      <w:bookmarkStart w:id="125" w:name="_Toc220769239"/>
       <w:r>
         <w:lastRenderedPageBreak/>
         <w:t xml:space="preserve">Roboter </w:t>
@@ -31428,7 +31434,7 @@
       <w:r>
         <w:t>: Pledge-Algorithmus</w:t>
       </w:r>
-      <w:bookmarkEnd w:id="122"/>
+      <w:bookmarkEnd w:id="125"/>
     </w:p>
     <w:p>
       <w:pPr>
@@ -31711,7 +31717,7 @@
       <w:pPr>
         <w:pStyle w:val="berschrift1"/>
       </w:pPr>
-      <w:bookmarkStart w:id="123" w:name="_Toc213070215"/>
+      <w:bookmarkStart w:id="126" w:name="_Toc220769240"/>
       <w:r>
         <w:lastRenderedPageBreak/>
         <w:t>Auto im Gegenverkehr</w:t>
@@ -31722,7 +31728,7 @@
       <w:r>
         <w:t>steuern</w:t>
       </w:r>
-      <w:bookmarkEnd w:id="123"/>
+      <w:bookmarkEnd w:id="126"/>
     </w:p>
     <w:p>
       <w:pPr>
@@ -31889,6 +31895,9 @@
         <w:spacing w:before="120"/>
       </w:pPr>
       <w:r>
+        <w:rPr>
+          <w:noProof/>
+        </w:rPr>
         <w:drawing>
           <wp:inline distT="0" distB="0" distL="0" distR="0" wp14:anchorId="2F55EC40" wp14:editId="202CF06B">
             <wp:extent cx="5125603" cy="6294120"/>
@@ -31928,6 +31937,9 @@
     </w:p>
     <w:p>
       <w:r>
+        <w:rPr>
+          <w:noProof/>
+        </w:rPr>
         <w:lastRenderedPageBreak/>
         <w:drawing>
           <wp:inline distT="0" distB="0" distL="0" distR="0" wp14:anchorId="0E5B66A1" wp14:editId="38118AE6">
@@ -31975,7 +31987,7 @@
       <w:pPr>
         <w:pStyle w:val="berschrift1"/>
       </w:pPr>
-      <w:bookmarkStart w:id="124" w:name="_Toc213070216"/>
+      <w:bookmarkStart w:id="127" w:name="_Toc220769241"/>
       <w:r>
         <w:lastRenderedPageBreak/>
         <w:t xml:space="preserve">Auto im Gegenverkehr: </w:t>
@@ -31983,7 +31995,7 @@
       <w:r>
         <w:t>Gegenverkehr kommt</w:t>
       </w:r>
-      <w:bookmarkEnd w:id="124"/>
+      <w:bookmarkEnd w:id="127"/>
     </w:p>
     <w:p>
       <w:pPr>
@@ -32163,6 +32175,9 @@
     <w:p/>
     <w:p>
       <w:r>
+        <w:rPr>
+          <w:noProof/>
+        </w:rPr>
         <w:drawing>
           <wp:inline distT="0" distB="0" distL="0" distR="0" wp14:anchorId="3E00AD30" wp14:editId="1710FF8D">
             <wp:extent cx="5387414" cy="5730240"/>
@@ -32209,7 +32224,7 @@
       <w:pPr>
         <w:pStyle w:val="berschrift1"/>
       </w:pPr>
-      <w:bookmarkStart w:id="125" w:name="_Toc213070217"/>
+      <w:bookmarkStart w:id="128" w:name="_Toc220769242"/>
       <w:r>
         <w:lastRenderedPageBreak/>
         <w:t xml:space="preserve">Auto im Gegenverkehr: </w:t>
@@ -32223,7 +32238,7 @@
       <w:r>
         <w:t>melden</w:t>
       </w:r>
-      <w:bookmarkEnd w:id="125"/>
+      <w:bookmarkEnd w:id="128"/>
     </w:p>
     <w:p>
       <w:pPr>
@@ -32386,9 +32401,9 @@
           <w:noProof/>
         </w:rPr>
         <w:drawing>
-          <wp:inline distT="0" distB="0" distL="0" distR="0" wp14:anchorId="29E4920B" wp14:editId="54B737C2">
-            <wp:extent cx="6241473" cy="1221339"/>
-            <wp:effectExtent l="0" t="0" r="6985" b="0"/>
+          <wp:inline distT="0" distB="0" distL="0" distR="0" wp14:anchorId="29E4920B" wp14:editId="0E3B6932">
+            <wp:extent cx="6658893" cy="1303020"/>
+            <wp:effectExtent l="0" t="0" r="8890" b="0"/>
             <wp:docPr id="1859166549" name="Grafik 1"/>
             <wp:cNvGraphicFramePr>
               <a:graphicFrameLocks xmlns:a="http://schemas.openxmlformats.org/drawingml/2006/main" noChangeAspect="1"/>
@@ -32409,7 +32424,7 @@
                   <pic:spPr>
                     <a:xfrm>
                       <a:off x="0" y="0"/>
-                      <a:ext cx="6270884" cy="1227094"/>
+                      <a:ext cx="6699100" cy="1310888"/>
                     </a:xfrm>
                     <a:prstGeom prst="rect">
                       <a:avLst/>
@@ -32434,13 +32449,12 @@
         <w:rPr>
           <w:b/>
           <w:bCs/>
-          <w:noProof/>
         </w:rPr>
         <w:drawing>
-          <wp:inline distT="0" distB="0" distL="0" distR="0" wp14:anchorId="12792D6E" wp14:editId="5DCDFDD8">
-            <wp:extent cx="6131447" cy="3629891"/>
-            <wp:effectExtent l="0" t="0" r="3175" b="8890"/>
-            <wp:docPr id="1831137127" name="Grafik 1"/>
+          <wp:inline distT="0" distB="0" distL="0" distR="0" wp14:anchorId="11902B24" wp14:editId="38CEFBCB">
+            <wp:extent cx="5737860" cy="5399049"/>
+            <wp:effectExtent l="0" t="0" r="0" b="0"/>
+            <wp:docPr id="733832939" name="Grafik 1"/>
             <wp:cNvGraphicFramePr>
               <a:graphicFrameLocks xmlns:a="http://schemas.openxmlformats.org/drawingml/2006/main" noChangeAspect="1"/>
             </wp:cNvGraphicFramePr>
@@ -32448,7 +32462,7 @@
               <a:graphicData uri="http://schemas.openxmlformats.org/drawingml/2006/picture">
                 <pic:pic xmlns:pic="http://schemas.openxmlformats.org/drawingml/2006/picture">
                   <pic:nvPicPr>
-                    <pic:cNvPr id="1831137127" name=""/>
+                    <pic:cNvPr id="733832939" name=""/>
                     <pic:cNvPicPr/>
                   </pic:nvPicPr>
                   <pic:blipFill>
@@ -32460,7 +32474,7 @@
                   <pic:spPr>
                     <a:xfrm>
                       <a:off x="0" y="0"/>
-                      <a:ext cx="6151881" cy="3641988"/>
+                      <a:ext cx="5748868" cy="5409407"/>
                     </a:xfrm>
                     <a:prstGeom prst="rect">
                       <a:avLst/>
@@ -32475,15 +32489,12 @@
     </w:p>
     <w:p>
       <w:r>
-        <w:rPr>
-          <w:noProof/>
-        </w:rPr>
         <w:lastRenderedPageBreak/>
         <w:drawing>
-          <wp:inline distT="0" distB="0" distL="0" distR="0" wp14:anchorId="105D8B21" wp14:editId="6998487E">
-            <wp:extent cx="6095811" cy="2147454"/>
-            <wp:effectExtent l="0" t="0" r="635" b="5715"/>
-            <wp:docPr id="989071127" name="Grafik 1"/>
+          <wp:inline distT="0" distB="0" distL="0" distR="0" wp14:anchorId="35041107" wp14:editId="72BA0E1C">
+            <wp:extent cx="6184080" cy="4770120"/>
+            <wp:effectExtent l="0" t="0" r="7620" b="0"/>
+            <wp:docPr id="330342774" name="Grafik 1"/>
             <wp:cNvGraphicFramePr>
               <a:graphicFrameLocks xmlns:a="http://schemas.openxmlformats.org/drawingml/2006/main" noChangeAspect="1"/>
             </wp:cNvGraphicFramePr>
@@ -32491,7 +32502,7 @@
               <a:graphicData uri="http://schemas.openxmlformats.org/drawingml/2006/picture">
                 <pic:pic xmlns:pic="http://schemas.openxmlformats.org/drawingml/2006/picture">
                   <pic:nvPicPr>
-                    <pic:cNvPr id="989071127" name=""/>
+                    <pic:cNvPr id="330342774" name=""/>
                     <pic:cNvPicPr/>
                   </pic:nvPicPr>
                   <pic:blipFill>
@@ -32503,7 +32514,7 @@
                   <pic:spPr>
                     <a:xfrm>
                       <a:off x="0" y="0"/>
-                      <a:ext cx="6123014" cy="2157037"/>
+                      <a:ext cx="6188946" cy="4773874"/>
                     </a:xfrm>
                     <a:prstGeom prst="rect">
                       <a:avLst/>
@@ -32516,16 +32527,192 @@
         </w:drawing>
       </w:r>
     </w:p>
+    <w:p/>
     <w:p>
       <w:r>
+        <w:br w:type="page"/>
+      </w:r>
+    </w:p>
+    <w:p>
+      <w:pPr>
+        <w:pStyle w:val="berschrift1"/>
+      </w:pPr>
+      <w:bookmarkStart w:id="129" w:name="_Toc220769243"/>
+      <w:r>
+        <w:lastRenderedPageBreak/>
+        <w:t xml:space="preserve">Auto im Gegenverkehr: </w:t>
+      </w:r>
+      <w:r>
+        <w:t>Gegenverkehr wird schneller</w:t>
+      </w:r>
+      <w:bookmarkEnd w:id="129"/>
+    </w:p>
+    <w:p>
+      <w:pPr>
+        <w:pStyle w:val="berschrift3"/>
+      </w:pPr>
+      <w:r>
+        <w:t xml:space="preserve">Aufgabe: Gegenverkehr wird schneller werden - </w:t>
+      </w:r>
+      <w:r>
+        <w:t>Spieler_Klasse_Gegner_Klasse_schneller.py</w:t>
+      </w:r>
+    </w:p>
+    <w:p>
+      <w:r>
+        <w:t xml:space="preserve">Das Programm bringt ein Fenster mit einem blauen Auto und einem entgegenkommenden roten Auto auf den Bildschirm. Jedes erfolgreiche Ausweichen des Spielers wird gezählt. Bei einem Zusammenstoß gibt es eine Meldung und das Programm endet. </w:t>
+      </w:r>
+      <w:r>
         <w:rPr>
-          <w:noProof/>
+          <w:i/>
+          <w:iCs/>
         </w:rPr>
+        <w:t xml:space="preserve">Das rote Auto wird mit jeder Sekunde schneller. </w:t>
+      </w:r>
+      <w:r>
+        <w:t xml:space="preserve">Starte das Programm. </w:t>
+      </w:r>
+      <w:r>
+        <w:t>Ändere das Programm und starte es erneut.</w:t>
+      </w:r>
+    </w:p>
+    <w:tbl>
+      <w:tblPr>
+        <w:tblStyle w:val="Tabellenraster"/>
+        <w:tblW w:w="0" w:type="auto"/>
+        <w:tblLook w:val="04A0" w:firstRow="1" w:lastRow="0" w:firstColumn="1" w:lastColumn="0" w:noHBand="0" w:noVBand="1"/>
+      </w:tblPr>
+      <w:tblGrid>
+        <w:gridCol w:w="6374"/>
+        <w:gridCol w:w="3827"/>
+      </w:tblGrid>
+      <w:tr>
+        <w:tc>
+          <w:tcPr>
+            <w:tcW w:w="6374" w:type="dxa"/>
+          </w:tcPr>
+          <w:p>
+            <w:pPr>
+              <w:rPr>
+                <w:b/>
+                <w:bCs/>
+              </w:rPr>
+            </w:pPr>
+            <w:r>
+              <w:rPr>
+                <w:b/>
+                <w:bCs/>
+              </w:rPr>
+              <w:t>Aufgabe</w:t>
+            </w:r>
+          </w:p>
+        </w:tc>
+        <w:tc>
+          <w:tcPr>
+            <w:tcW w:w="3827" w:type="dxa"/>
+          </w:tcPr>
+          <w:p>
+            <w:pPr>
+              <w:rPr>
+                <w:b/>
+                <w:bCs/>
+              </w:rPr>
+            </w:pPr>
+            <w:r>
+              <w:rPr>
+                <w:b/>
+                <w:bCs/>
+              </w:rPr>
+              <w:t>Ergebnis</w:t>
+            </w:r>
+          </w:p>
+        </w:tc>
+      </w:tr>
+      <w:tr>
+        <w:tc>
+          <w:tcPr>
+            <w:tcW w:w="6374" w:type="dxa"/>
+          </w:tcPr>
+          <w:p>
+            <w:r>
+              <w:t>Steuere das Auto mit den Links- und Rechts-Pfeiltasten der Tastatur.</w:t>
+            </w:r>
+            <w:r>
+              <w:t xml:space="preserve"> Mache </w:t>
+            </w:r>
+            <w:r>
+              <w:t>4</w:t>
+            </w:r>
+            <w:r>
+              <w:t xml:space="preserve"> Läufe und notiere d</w:t>
+            </w:r>
+            <w:r>
+              <w:t>ie</w:t>
+            </w:r>
+            <w:r>
+              <w:t xml:space="preserve"> Score</w:t>
+            </w:r>
+            <w:r>
+              <w:t>s</w:t>
+            </w:r>
+            <w:r>
+              <w:t xml:space="preserve">. </w:t>
+            </w:r>
+          </w:p>
+        </w:tc>
+        <w:tc>
+          <w:tcPr>
+            <w:tcW w:w="3827" w:type="dxa"/>
+          </w:tcPr>
+          <w:p/>
+        </w:tc>
+      </w:tr>
+      <w:tr>
+        <w:tc>
+          <w:tcPr>
+            <w:tcW w:w="6374" w:type="dxa"/>
+          </w:tcPr>
+          <w:p>
+            <w:r>
+              <w:t xml:space="preserve">Nun soll das Auto jede Sekunde die Geschwindigkeit wechseln. </w:t>
+            </w:r>
+          </w:p>
+          <w:p>
+            <w:r>
+              <w:t xml:space="preserve">Die Geschwindigkeit ist ein Zufallswert zwischen 5 und </w:t>
+            </w:r>
+            <w:r>
+              <w:t>2</w:t>
+            </w:r>
+            <w:r>
+              <w:t>0.</w:t>
+            </w:r>
+            <w:r>
+              <w:t xml:space="preserve"> </w:t>
+            </w:r>
+          </w:p>
+          <w:p>
+            <w:r>
+              <w:t>Mache 4 Läufe und notiere die Scores.</w:t>
+            </w:r>
+          </w:p>
+        </w:tc>
+        <w:tc>
+          <w:tcPr>
+            <w:tcW w:w="3827" w:type="dxa"/>
+          </w:tcPr>
+          <w:p/>
+        </w:tc>
+      </w:tr>
+    </w:tbl>
+    <w:p/>
+    <w:p>
+      <w:r>
         <w:drawing>
-          <wp:inline distT="0" distB="0" distL="0" distR="0" wp14:anchorId="2814E580" wp14:editId="0B7FD680">
-            <wp:extent cx="6276109" cy="4218054"/>
-            <wp:effectExtent l="0" t="0" r="0" b="0"/>
-            <wp:docPr id="2098548697" name="Grafik 1"/>
+          <wp:inline distT="0" distB="0" distL="0" distR="0" wp14:anchorId="62CCED80" wp14:editId="3B2F5F57">
+            <wp:extent cx="6645910" cy="3695700"/>
+            <wp:effectExtent l="0" t="0" r="2540" b="0"/>
+            <wp:docPr id="1521375703" name="Grafik 1"/>
             <wp:cNvGraphicFramePr>
               <a:graphicFrameLocks xmlns:a="http://schemas.openxmlformats.org/drawingml/2006/main" noChangeAspect="1"/>
             </wp:cNvGraphicFramePr>
@@ -32533,7 +32720,7 @@
               <a:graphicData uri="http://schemas.openxmlformats.org/drawingml/2006/picture">
                 <pic:pic xmlns:pic="http://schemas.openxmlformats.org/drawingml/2006/picture">
                   <pic:nvPicPr>
-                    <pic:cNvPr id="2098548697" name=""/>
+                    <pic:cNvPr id="1521375703" name=""/>
                     <pic:cNvPicPr/>
                   </pic:nvPicPr>
                   <pic:blipFill>
@@ -32545,7 +32732,7 @@
                   <pic:spPr>
                     <a:xfrm>
                       <a:off x="0" y="0"/>
-                      <a:ext cx="6280478" cy="4220990"/>
+                      <a:ext cx="6645910" cy="3695700"/>
                     </a:xfrm>
                     <a:prstGeom prst="rect">
                       <a:avLst/>
@@ -32558,194 +32745,14 @@
         </w:drawing>
       </w:r>
     </w:p>
-    <w:p>
-      <w:r>
-        <w:br w:type="page"/>
-      </w:r>
-    </w:p>
-    <w:p>
-      <w:pPr>
-        <w:pStyle w:val="berschrift1"/>
-      </w:pPr>
-      <w:bookmarkStart w:id="126" w:name="_Toc213070218"/>
-      <w:r>
-        <w:lastRenderedPageBreak/>
-        <w:t xml:space="preserve">Auto im Gegenverkehr: </w:t>
-      </w:r>
-      <w:r>
-        <w:t>Gegenverkehr wird schneller</w:t>
-      </w:r>
-      <w:bookmarkEnd w:id="126"/>
-    </w:p>
-    <w:p>
-      <w:pPr>
-        <w:pStyle w:val="berschrift3"/>
-      </w:pPr>
-      <w:r>
-        <w:t xml:space="preserve">Aufgabe: Gegenverkehr wird schneller werden - </w:t>
-      </w:r>
-      <w:r>
-        <w:t>Spieler_Klasse_Gegner_Klasse_schneller.py</w:t>
-      </w:r>
-    </w:p>
-    <w:p>
-      <w:r>
-        <w:t xml:space="preserve">Das Programm bringt ein Fenster mit einem blauen Auto und einem entgegenkommenden roten Auto auf den Bildschirm. Jedes erfolgreiche Ausweichen des Spielers wird gezählt. Bei einem Zusammenstoß gibt es eine Meldung und das Programm endet. </w:t>
-      </w:r>
-      <w:r>
-        <w:rPr>
-          <w:i/>
-          <w:iCs/>
-        </w:rPr>
-        <w:t xml:space="preserve">Das rote Auto wird mit jeder Sekunde schneller. </w:t>
-      </w:r>
-      <w:r>
-        <w:t xml:space="preserve">Starte das Programm. </w:t>
-      </w:r>
-      <w:r>
-        <w:t>Ändere das Programm und starte es erneut.</w:t>
-      </w:r>
-    </w:p>
-    <w:tbl>
-      <w:tblPr>
-        <w:tblStyle w:val="Tabellenraster"/>
-        <w:tblW w:w="0" w:type="auto"/>
-        <w:tblLook w:val="04A0" w:firstRow="1" w:lastRow="0" w:firstColumn="1" w:lastColumn="0" w:noHBand="0" w:noVBand="1"/>
-      </w:tblPr>
-      <w:tblGrid>
-        <w:gridCol w:w="6374"/>
-        <w:gridCol w:w="3827"/>
-      </w:tblGrid>
-      <w:tr>
-        <w:tc>
-          <w:tcPr>
-            <w:tcW w:w="6374" w:type="dxa"/>
-          </w:tcPr>
-          <w:p>
-            <w:pPr>
-              <w:rPr>
-                <w:b/>
-                <w:bCs/>
-              </w:rPr>
-            </w:pPr>
-            <w:r>
-              <w:rPr>
-                <w:b/>
-                <w:bCs/>
-              </w:rPr>
-              <w:t>Aufgabe</w:t>
-            </w:r>
-          </w:p>
-        </w:tc>
-        <w:tc>
-          <w:tcPr>
-            <w:tcW w:w="3827" w:type="dxa"/>
-          </w:tcPr>
-          <w:p>
-            <w:pPr>
-              <w:rPr>
-                <w:b/>
-                <w:bCs/>
-              </w:rPr>
-            </w:pPr>
-            <w:r>
-              <w:rPr>
-                <w:b/>
-                <w:bCs/>
-              </w:rPr>
-              <w:t>Ergebnis</w:t>
-            </w:r>
-          </w:p>
-        </w:tc>
-      </w:tr>
-      <w:tr>
-        <w:tc>
-          <w:tcPr>
-            <w:tcW w:w="6374" w:type="dxa"/>
-          </w:tcPr>
-          <w:p>
-            <w:r>
-              <w:t>Steuere das Auto mit den Links- und Rechts-Pfeiltasten der Tastatur.</w:t>
-            </w:r>
-            <w:r>
-              <w:t xml:space="preserve"> Mache </w:t>
-            </w:r>
-            <w:r>
-              <w:t>4</w:t>
-            </w:r>
-            <w:r>
-              <w:t xml:space="preserve"> Läufe und notiere d</w:t>
-            </w:r>
-            <w:r>
-              <w:t>ie</w:t>
-            </w:r>
-            <w:r>
-              <w:t xml:space="preserve"> Score</w:t>
-            </w:r>
-            <w:r>
-              <w:t>s</w:t>
-            </w:r>
-            <w:r>
-              <w:t xml:space="preserve">. </w:t>
-            </w:r>
-          </w:p>
-        </w:tc>
-        <w:tc>
-          <w:tcPr>
-            <w:tcW w:w="3827" w:type="dxa"/>
-          </w:tcPr>
-          <w:p/>
-        </w:tc>
-      </w:tr>
-      <w:tr>
-        <w:tc>
-          <w:tcPr>
-            <w:tcW w:w="6374" w:type="dxa"/>
-          </w:tcPr>
-          <w:p>
-            <w:r>
-              <w:t xml:space="preserve">Nun soll das Auto jede Sekunde die Geschwindigkeit wechseln. </w:t>
-            </w:r>
-          </w:p>
-          <w:p>
-            <w:r>
-              <w:t xml:space="preserve">Die Geschwindigkeit ist ein Zufallswert zwischen 5 und </w:t>
-            </w:r>
-            <w:r>
-              <w:t>2</w:t>
-            </w:r>
-            <w:r>
-              <w:t>0.</w:t>
-            </w:r>
-            <w:r>
-              <w:t xml:space="preserve"> </w:t>
-            </w:r>
-          </w:p>
-          <w:p>
-            <w:r>
-              <w:t>Mache 4 Läufe und notiere die Scores.</w:t>
-            </w:r>
-          </w:p>
-        </w:tc>
-        <w:tc>
-          <w:tcPr>
-            <w:tcW w:w="3827" w:type="dxa"/>
-          </w:tcPr>
-          <w:p/>
-        </w:tc>
-      </w:tr>
-    </w:tbl>
     <w:p/>
     <w:p>
       <w:r>
-        <w:rPr>
-          <w:noProof/>
-        </w:rPr>
         <w:drawing>
-          <wp:inline distT="0" distB="0" distL="0" distR="0" wp14:anchorId="309C94B8" wp14:editId="44EF6089">
-            <wp:extent cx="6645910" cy="3698240"/>
+          <wp:inline distT="0" distB="0" distL="0" distR="0" wp14:anchorId="47E7320E" wp14:editId="0AE3F9AC">
+            <wp:extent cx="6645910" cy="616585"/>
             <wp:effectExtent l="0" t="0" r="2540" b="0"/>
-            <wp:docPr id="1910091214" name="Grafik 1"/>
+            <wp:docPr id="1804917832" name="Grafik 1"/>
             <wp:cNvGraphicFramePr>
               <a:graphicFrameLocks xmlns:a="http://schemas.openxmlformats.org/drawingml/2006/main" noChangeAspect="1"/>
             </wp:cNvGraphicFramePr>
@@ -32753,7 +32760,7 @@
               <a:graphicData uri="http://schemas.openxmlformats.org/drawingml/2006/picture">
                 <pic:pic xmlns:pic="http://schemas.openxmlformats.org/drawingml/2006/picture">
                   <pic:nvPicPr>
-                    <pic:cNvPr id="1910091214" name=""/>
+                    <pic:cNvPr id="1804917832" name=""/>
                     <pic:cNvPicPr/>
                   </pic:nvPicPr>
                   <pic:blipFill>
@@ -32765,7 +32772,7 @@
                   <pic:spPr>
                     <a:xfrm>
                       <a:off x="0" y="0"/>
-                      <a:ext cx="6645910" cy="3698240"/>
+                      <a:ext cx="6645910" cy="616585"/>
                     </a:xfrm>
                     <a:prstGeom prst="rect">
                       <a:avLst/>
@@ -32781,14 +32788,11 @@
     <w:p/>
     <w:p>
       <w:r>
-        <w:rPr>
-          <w:noProof/>
-        </w:rPr>
         <w:drawing>
-          <wp:inline distT="0" distB="0" distL="0" distR="0" wp14:anchorId="4FFAD859" wp14:editId="66438501">
-            <wp:extent cx="6645910" cy="562610"/>
-            <wp:effectExtent l="0" t="0" r="2540" b="8890"/>
-            <wp:docPr id="804454814" name="Grafik 1"/>
+          <wp:inline distT="0" distB="0" distL="0" distR="0" wp14:anchorId="19A33ACE" wp14:editId="01146FFA">
+            <wp:extent cx="6332220" cy="1467797"/>
+            <wp:effectExtent l="0" t="0" r="0" b="0"/>
+            <wp:docPr id="1541430108" name="Grafik 1"/>
             <wp:cNvGraphicFramePr>
               <a:graphicFrameLocks xmlns:a="http://schemas.openxmlformats.org/drawingml/2006/main" noChangeAspect="1"/>
             </wp:cNvGraphicFramePr>
@@ -32796,7 +32800,7 @@
               <a:graphicData uri="http://schemas.openxmlformats.org/drawingml/2006/picture">
                 <pic:pic xmlns:pic="http://schemas.openxmlformats.org/drawingml/2006/picture">
                   <pic:nvPicPr>
-                    <pic:cNvPr id="804454814" name=""/>
+                    <pic:cNvPr id="1541430108" name=""/>
                     <pic:cNvPicPr/>
                   </pic:nvPicPr>
                   <pic:blipFill>
@@ -32808,7 +32812,7 @@
                   <pic:spPr>
                     <a:xfrm>
                       <a:off x="0" y="0"/>
-                      <a:ext cx="6645910" cy="562610"/>
+                      <a:ext cx="6343961" cy="1470519"/>
                     </a:xfrm>
                     <a:prstGeom prst="rect">
                       <a:avLst/>
@@ -32821,60 +32825,11 @@
         </w:drawing>
       </w:r>
     </w:p>
-    <w:p/>
     <w:p>
-      <w:r>
-        <w:rPr>
-          <w:noProof/>
-        </w:rPr>
-        <w:drawing>
-          <wp:inline distT="0" distB="0" distL="0" distR="0" wp14:anchorId="24A83F83" wp14:editId="48EB5E7A">
-            <wp:extent cx="6645910" cy="1160145"/>
-            <wp:effectExtent l="0" t="0" r="2540" b="1905"/>
-            <wp:docPr id="1966451678" name="Grafik 1"/>
-            <wp:cNvGraphicFramePr>
-              <a:graphicFrameLocks xmlns:a="http://schemas.openxmlformats.org/drawingml/2006/main" noChangeAspect="1"/>
-            </wp:cNvGraphicFramePr>
-            <a:graphic xmlns:a="http://schemas.openxmlformats.org/drawingml/2006/main">
-              <a:graphicData uri="http://schemas.openxmlformats.org/drawingml/2006/picture">
-                <pic:pic xmlns:pic="http://schemas.openxmlformats.org/drawingml/2006/picture">
-                  <pic:nvPicPr>
-                    <pic:cNvPr id="1966451678" name=""/>
-                    <pic:cNvPicPr/>
-                  </pic:nvPicPr>
-                  <pic:blipFill>
-                    <a:blip r:embed="rId50"/>
-                    <a:stretch>
-                      <a:fillRect/>
-                    </a:stretch>
-                  </pic:blipFill>
-                  <pic:spPr>
-                    <a:xfrm>
-                      <a:off x="0" y="0"/>
-                      <a:ext cx="6645910" cy="1160145"/>
-                    </a:xfrm>
-                    <a:prstGeom prst="rect">
-                      <a:avLst/>
-                    </a:prstGeom>
-                  </pic:spPr>
-                </pic:pic>
-              </a:graphicData>
-            </a:graphic>
-          </wp:inline>
-        </w:drawing>
-      </w:r>
-    </w:p>
-    <w:p/>
-    <w:p>
-      <w:r>
-        <w:br w:type="page"/>
-      </w:r>
-    </w:p>
-    <w:p>
       <w:pPr>
         <w:pStyle w:val="berschrift1"/>
       </w:pPr>
-      <w:bookmarkStart w:id="127" w:name="_Toc213070219"/>
+      <w:bookmarkStart w:id="130" w:name="_Toc220769244"/>
       <w:r>
         <w:lastRenderedPageBreak/>
         <w:t xml:space="preserve">Auto im Gegenverkehr: </w:t>
@@ -32882,7 +32837,7 @@
       <w:r>
         <w:t>Straße und Sound</w:t>
       </w:r>
-      <w:bookmarkEnd w:id="127"/>
+      <w:bookmarkEnd w:id="130"/>
     </w:p>
     <w:p>
       <w:pPr>
@@ -33011,13 +32966,12 @@
         <w:rPr>
           <w:b/>
           <w:bCs/>
-          <w:noProof/>
         </w:rPr>
         <w:drawing>
-          <wp:inline distT="0" distB="0" distL="0" distR="0" wp14:anchorId="6BB8F7DA" wp14:editId="2D654459">
-            <wp:extent cx="6533709" cy="284671"/>
-            <wp:effectExtent l="0" t="0" r="635" b="1270"/>
-            <wp:docPr id="153276065" name="Grafik 1"/>
+          <wp:inline distT="0" distB="0" distL="0" distR="0" wp14:anchorId="422B8E41" wp14:editId="10EF2F14">
+            <wp:extent cx="6645910" cy="331470"/>
+            <wp:effectExtent l="0" t="0" r="2540" b="0"/>
+            <wp:docPr id="1807866276" name="Grafik 1"/>
             <wp:cNvGraphicFramePr>
               <a:graphicFrameLocks xmlns:a="http://schemas.openxmlformats.org/drawingml/2006/main" noChangeAspect="1"/>
             </wp:cNvGraphicFramePr>
@@ -33025,7 +32979,47 @@
               <a:graphicData uri="http://schemas.openxmlformats.org/drawingml/2006/picture">
                 <pic:pic xmlns:pic="http://schemas.openxmlformats.org/drawingml/2006/picture">
                   <pic:nvPicPr>
-                    <pic:cNvPr id="153276065" name=""/>
+                    <pic:cNvPr id="1807866276" name=""/>
+                    <pic:cNvPicPr/>
+                  </pic:nvPicPr>
+                  <pic:blipFill>
+                    <a:blip r:embed="rId50"/>
+                    <a:stretch>
+                      <a:fillRect/>
+                    </a:stretch>
+                  </pic:blipFill>
+                  <pic:spPr>
+                    <a:xfrm>
+                      <a:off x="0" y="0"/>
+                      <a:ext cx="6645910" cy="331470"/>
+                    </a:xfrm>
+                    <a:prstGeom prst="rect">
+                      <a:avLst/>
+                    </a:prstGeom>
+                  </pic:spPr>
+                </pic:pic>
+              </a:graphicData>
+            </a:graphic>
+          </wp:inline>
+        </w:drawing>
+      </w:r>
+    </w:p>
+    <w:p/>
+    <w:p>
+      <w:r>
+        <w:drawing>
+          <wp:inline distT="0" distB="0" distL="0" distR="0" wp14:anchorId="37DD7B2C" wp14:editId="3A966078">
+            <wp:extent cx="6645910" cy="339725"/>
+            <wp:effectExtent l="0" t="0" r="2540" b="3175"/>
+            <wp:docPr id="1007063035" name="Grafik 1"/>
+            <wp:cNvGraphicFramePr>
+              <a:graphicFrameLocks xmlns:a="http://schemas.openxmlformats.org/drawingml/2006/main" noChangeAspect="1"/>
+            </wp:cNvGraphicFramePr>
+            <a:graphic xmlns:a="http://schemas.openxmlformats.org/drawingml/2006/main">
+              <a:graphicData uri="http://schemas.openxmlformats.org/drawingml/2006/picture">
+                <pic:pic xmlns:pic="http://schemas.openxmlformats.org/drawingml/2006/picture">
+                  <pic:nvPicPr>
+                    <pic:cNvPr id="1007063035" name=""/>
                     <pic:cNvPicPr/>
                   </pic:nvPicPr>
                   <pic:blipFill>
@@ -33037,7 +33031,7 @@
                   <pic:spPr>
                     <a:xfrm>
                       <a:off x="0" y="0"/>
-                      <a:ext cx="6890734" cy="300226"/>
+                      <a:ext cx="6645910" cy="339725"/>
                     </a:xfrm>
                     <a:prstGeom prst="rect">
                       <a:avLst/>
@@ -33053,14 +33047,11 @@
     <w:p/>
     <w:p>
       <w:r>
-        <w:rPr>
-          <w:noProof/>
-        </w:rPr>
         <w:drawing>
-          <wp:inline distT="0" distB="0" distL="0" distR="0" wp14:anchorId="4086B808" wp14:editId="5DAD9F32">
-            <wp:extent cx="6366294" cy="238447"/>
-            <wp:effectExtent l="0" t="0" r="0" b="9525"/>
-            <wp:docPr id="1353613323" name="Grafik 1"/>
+          <wp:inline distT="0" distB="0" distL="0" distR="0" wp14:anchorId="7F01C557" wp14:editId="577D9E0F">
+            <wp:extent cx="6645910" cy="322580"/>
+            <wp:effectExtent l="0" t="0" r="2540" b="1270"/>
+            <wp:docPr id="925458742" name="Grafik 1"/>
             <wp:cNvGraphicFramePr>
               <a:graphicFrameLocks xmlns:a="http://schemas.openxmlformats.org/drawingml/2006/main" noChangeAspect="1"/>
             </wp:cNvGraphicFramePr>
@@ -33068,7 +33059,7 @@
               <a:graphicData uri="http://schemas.openxmlformats.org/drawingml/2006/picture">
                 <pic:pic xmlns:pic="http://schemas.openxmlformats.org/drawingml/2006/picture">
                   <pic:nvPicPr>
-                    <pic:cNvPr id="1353613323" name=""/>
+                    <pic:cNvPr id="925458742" name=""/>
                     <pic:cNvPicPr/>
                   </pic:nvPicPr>
                   <pic:blipFill>
@@ -33080,7 +33071,7 @@
                   <pic:spPr>
                     <a:xfrm>
                       <a:off x="0" y="0"/>
-                      <a:ext cx="7710882" cy="288808"/>
+                      <a:ext cx="6645910" cy="322580"/>
                     </a:xfrm>
                     <a:prstGeom prst="rect">
                       <a:avLst/>
@@ -33094,48 +33085,7 @@
       </w:r>
     </w:p>
     <w:p/>
-    <w:p>
-      <w:r>
-        <w:rPr>
-          <w:noProof/>
-        </w:rPr>
-        <w:drawing>
-          <wp:inline distT="0" distB="0" distL="0" distR="0" wp14:anchorId="7DC2C181" wp14:editId="179A430E">
-            <wp:extent cx="6405945" cy="276045"/>
-            <wp:effectExtent l="0" t="0" r="0" b="0"/>
-            <wp:docPr id="1283509734" name="Grafik 1"/>
-            <wp:cNvGraphicFramePr>
-              <a:graphicFrameLocks xmlns:a="http://schemas.openxmlformats.org/drawingml/2006/main" noChangeAspect="1"/>
-            </wp:cNvGraphicFramePr>
-            <a:graphic xmlns:a="http://schemas.openxmlformats.org/drawingml/2006/main">
-              <a:graphicData uri="http://schemas.openxmlformats.org/drawingml/2006/picture">
-                <pic:pic xmlns:pic="http://schemas.openxmlformats.org/drawingml/2006/picture">
-                  <pic:nvPicPr>
-                    <pic:cNvPr id="1283509734" name=""/>
-                    <pic:cNvPicPr/>
-                  </pic:nvPicPr>
-                  <pic:blipFill>
-                    <a:blip r:embed="rId53"/>
-                    <a:stretch>
-                      <a:fillRect/>
-                    </a:stretch>
-                  </pic:blipFill>
-                  <pic:spPr>
-                    <a:xfrm>
-                      <a:off x="0" y="0"/>
-                      <a:ext cx="7174965" cy="309184"/>
-                    </a:xfrm>
-                    <a:prstGeom prst="rect">
-                      <a:avLst/>
-                    </a:prstGeom>
-                  </pic:spPr>
-                </pic:pic>
-              </a:graphicData>
-            </a:graphic>
-          </wp:inline>
-        </w:drawing>
-      </w:r>
-    </w:p>
+    <w:p/>
     <w:p/>
     <w:p>
       <w:r>
@@ -33146,12 +33096,12 @@
       <w:pPr>
         <w:pStyle w:val="berschrift1"/>
       </w:pPr>
-      <w:bookmarkStart w:id="128" w:name="_Toc213070220"/>
+      <w:bookmarkStart w:id="131" w:name="_Toc220769245"/>
       <w:r>
         <w:lastRenderedPageBreak/>
         <w:t>Ein Dinosaurier überquert die Straße</w:t>
       </w:r>
-      <w:bookmarkEnd w:id="128"/>
+      <w:bookmarkEnd w:id="131"/>
     </w:p>
     <w:p>
       <w:pPr>
@@ -33447,13 +33397,16 @@
           </w:tcPr>
           <w:p>
             <w:r>
+              <w:t xml:space="preserve">Spieler-Klasse: </w:t>
+            </w:r>
+            <w:r>
               <w:t xml:space="preserve">Lade </w:t>
             </w:r>
             <w:r>
               <w:t>1</w:t>
             </w:r>
             <w:r>
-              <w:t xml:space="preserve"> Dinosaurier-Bild</w:t>
+              <w:t xml:space="preserve"> Dino-Bild</w:t>
             </w:r>
             <w:r>
               <w:t xml:space="preserve"> für </w:t>
@@ -33464,15 +33417,19 @@
             </w:r>
             <w:proofErr w:type="spellEnd"/>
             <w:r>
-              <w:t xml:space="preserve"> – rechts und 1 Dinosaurier-Bild für </w:t>
-            </w:r>
-            <w:proofErr w:type="spellStart"/>
-            <w:r>
-              <w:t>rechts</w:t>
-            </w:r>
-            <w:proofErr w:type="spellEnd"/>
-            <w:r>
-              <w:t xml:space="preserve"> – links:</w:t>
+              <w:t xml:space="preserve"> </w:t>
+            </w:r>
+            <w:r>
+              <w:sym w:font="Symbol" w:char="F0AE"/>
+            </w:r>
+            <w:r>
+              <w:t xml:space="preserve"> rechts und 1 Dino-Bild für rechts </w:t>
+            </w:r>
+            <w:r>
+              <w:sym w:font="Symbol" w:char="F0AE"/>
+            </w:r>
+            <w:r>
+              <w:t xml:space="preserve"> links:</w:t>
             </w:r>
             <w:r>
               <w:br/>
@@ -33929,7 +33886,13 @@
           </w:p>
           <w:p>
             <w:r>
-              <w:t xml:space="preserve">Ersetze </w:t>
+              <w:t>Ersetze</w:t>
+            </w:r>
+            <w:r>
+              <w:t xml:space="preserve"> in der Spieler-Klasse</w:t>
+            </w:r>
+            <w:r>
+              <w:t xml:space="preserve"> </w:t>
             </w:r>
             <w:proofErr w:type="spellStart"/>
             <w:proofErr w:type="gramStart"/>
@@ -34012,12 +33975,21 @@
               <w:t>Ersetze in</w:t>
             </w:r>
             <w:r>
-              <w:t xml:space="preserve"> der Methode</w:t>
-            </w:r>
-            <w:r>
               <w:t xml:space="preserve"> </w:t>
             </w:r>
             <w:r>
+              <w:t xml:space="preserve">den </w:t>
+            </w:r>
+            <w:r>
+              <w:t>Methode</w:t>
+            </w:r>
+            <w:r>
+              <w:t>n</w:t>
+            </w:r>
+            <w:r>
+              <w:t xml:space="preserve"> </w:t>
+            </w:r>
+            <w:r>
               <w:rPr>
                 <w:rFonts w:ascii="Courier New" w:hAnsi="Courier New" w:cs="Courier New"/>
               </w:rPr>
@@ -34052,10 +34024,7 @@
               <w:t>)</w:t>
             </w:r>
             <w:r>
-              <w:t xml:space="preserve"> und in </w:t>
-            </w:r>
-            <w:r>
-              <w:t xml:space="preserve">der Methode </w:t>
+              <w:t xml:space="preserve"> und </w:t>
             </w:r>
             <w:proofErr w:type="spellStart"/>
             <w:proofErr w:type="gramStart"/>
@@ -34081,16 +34050,91 @@
             </w:r>
             <w:r>
               <w:rPr>
+                <w:rFonts w:cstheme="minorHAnsi"/>
+              </w:rPr>
+              <w:t>der Gegner-Klasse</w:t>
+            </w:r>
+            <w:r>
+              <w:rPr>
+                <w:rFonts w:cstheme="minorHAnsi"/>
+              </w:rPr>
+              <w:t>:</w:t>
+            </w:r>
+            <w:r>
+              <w:t xml:space="preserve">     </w:t>
+            </w:r>
+            <w:r>
+              <w:br/>
+            </w:r>
+            <w:proofErr w:type="spellStart"/>
+            <w:proofErr w:type="gramStart"/>
+            <w:r>
+              <w:rPr>
+                <w:rFonts w:ascii="Courier New" w:hAnsi="Courier New" w:cs="Courier New"/>
+              </w:rPr>
+              <w:t>self.rect</w:t>
+            </w:r>
+            <w:proofErr w:type="gramEnd"/>
+            <w:r>
+              <w:rPr>
+                <w:rFonts w:ascii="Courier New" w:hAnsi="Courier New" w:cs="Courier New"/>
+              </w:rPr>
+              <w:t>.center</w:t>
+            </w:r>
+            <w:proofErr w:type="spellEnd"/>
+            <w:r>
+              <w:rPr>
                 <w:rFonts w:ascii="Courier New" w:hAnsi="Courier New" w:cs="Courier New"/>
               </w:rPr>
               <w:t xml:space="preserve"> </w:t>
             </w:r>
             <w:r>
-              <w:t xml:space="preserve">      </w:t>
-            </w:r>
-            <w:r>
+              <w:rPr>
+                <w:rFonts w:ascii="Courier New" w:hAnsi="Courier New" w:cs="Courier New"/>
+              </w:rPr>
+              <w:t>=(</w:t>
+            </w:r>
+            <w:proofErr w:type="spellStart"/>
+            <w:proofErr w:type="gramStart"/>
+            <w:r>
+              <w:rPr>
+                <w:rFonts w:ascii="Courier New" w:hAnsi="Courier New" w:cs="Courier New"/>
+              </w:rPr>
+              <w:t>random.randint</w:t>
+            </w:r>
+            <w:proofErr w:type="spellEnd"/>
+            <w:proofErr w:type="gramEnd"/>
+            <w:r>
+              <w:rPr>
+                <w:rFonts w:ascii="Courier New" w:hAnsi="Courier New" w:cs="Courier New"/>
+              </w:rPr>
+              <w:t>(</w:t>
+            </w:r>
+            <w:proofErr w:type="gramStart"/>
+            <w:r>
+              <w:rPr>
+                <w:rFonts w:ascii="Courier New" w:hAnsi="Courier New" w:cs="Courier New"/>
+              </w:rPr>
+              <w:t>40,SCREEN</w:t>
+            </w:r>
+            <w:proofErr w:type="gramEnd"/>
+            <w:r>
+              <w:rPr>
+                <w:rFonts w:ascii="Courier New" w:hAnsi="Courier New" w:cs="Courier New"/>
+              </w:rPr>
+              <w:t>_WIDTH-40),0)</w:t>
+            </w:r>
+            <w:r>
+              <w:rPr>
+                <w:rFonts w:ascii="Courier New" w:hAnsi="Courier New" w:cs="Courier New"/>
+              </w:rPr>
               <w:br/>
             </w:r>
+            <w:r>
+              <w:t xml:space="preserve">durch: </w:t>
+            </w:r>
+          </w:p>
+          <w:p>
             <w:proofErr w:type="spellStart"/>
             <w:proofErr w:type="gramStart"/>
             <w:r>
@@ -34111,357 +34155,318 @@
               <w:rPr>
                 <w:rFonts w:ascii="Courier New" w:hAnsi="Courier New" w:cs="Courier New"/>
               </w:rPr>
+              <w:t>=(</w:t>
+            </w:r>
+            <w:proofErr w:type="spellStart"/>
+            <w:proofErr w:type="gramStart"/>
+            <w:r>
+              <w:rPr>
+                <w:rFonts w:ascii="Courier New" w:hAnsi="Courier New" w:cs="Courier New"/>
+              </w:rPr>
+              <w:t>random.randint</w:t>
+            </w:r>
+            <w:proofErr w:type="spellEnd"/>
+            <w:proofErr w:type="gramEnd"/>
+            <w:r>
+              <w:rPr>
+                <w:rFonts w:ascii="Courier New" w:hAnsi="Courier New" w:cs="Courier New"/>
+              </w:rPr>
+              <w:t>(</w:t>
+            </w:r>
+            <w:proofErr w:type="gramStart"/>
+            <w:r>
+              <w:rPr>
+                <w:rFonts w:ascii="Courier New" w:hAnsi="Courier New" w:cs="Courier New"/>
+              </w:rPr>
+              <w:t>15</w:t>
+            </w:r>
+            <w:r>
+              <w:rPr>
+                <w:rFonts w:ascii="Courier New" w:hAnsi="Courier New" w:cs="Courier New"/>
+              </w:rPr>
+              <w:t>0,SCREEN</w:t>
+            </w:r>
+            <w:proofErr w:type="gramEnd"/>
+            <w:r>
+              <w:rPr>
+                <w:rFonts w:ascii="Courier New" w:hAnsi="Courier New" w:cs="Courier New"/>
+              </w:rPr>
+              <w:t>_WIDTH-</w:t>
+            </w:r>
+            <w:r>
+              <w:rPr>
+                <w:rFonts w:ascii="Courier New" w:hAnsi="Courier New" w:cs="Courier New"/>
+              </w:rPr>
+              <w:t>15</w:t>
+            </w:r>
+            <w:r>
+              <w:rPr>
+                <w:rFonts w:ascii="Courier New" w:hAnsi="Courier New" w:cs="Courier New"/>
+              </w:rPr>
+              <w:t>0),0)</w:t>
+            </w:r>
+          </w:p>
+        </w:tc>
+        <w:tc>
+          <w:tcPr>
+            <w:tcW w:w="1746" w:type="dxa"/>
+          </w:tcPr>
+          <w:p/>
+        </w:tc>
+      </w:tr>
+      <w:tr>
+        <w:tc>
+          <w:tcPr>
+            <w:tcW w:w="479" w:type="dxa"/>
+          </w:tcPr>
+          <w:p>
+            <w:r>
+              <w:t>4</w:t>
+            </w:r>
+          </w:p>
+        </w:tc>
+        <w:tc>
+          <w:tcPr>
+            <w:tcW w:w="8231" w:type="dxa"/>
+          </w:tcPr>
+          <w:p>
+            <w:r>
+              <w:t>Das Auto-Spiel berechnet den</w:t>
+            </w:r>
+            <w:r>
+              <w:t xml:space="preserve"> Score in der Gegner</w:t>
+            </w:r>
+            <w:r>
+              <w:t>-</w:t>
+            </w:r>
+            <w:r>
+              <w:t xml:space="preserve">Klasse. </w:t>
+            </w:r>
+          </w:p>
+          <w:p>
+            <w:r>
+              <w:t>Unser Dinosaurier-Spiel berechnet den Score i</w:t>
+            </w:r>
+            <w:r>
+              <w:t xml:space="preserve">n der </w:t>
+            </w:r>
+            <w:r>
+              <w:rPr>
+                <w:u w:val="single"/>
+              </w:rPr>
+              <w:t>Spieler-Klasse</w:t>
+            </w:r>
+            <w:r>
+              <w:t>.</w:t>
+            </w:r>
+            <w:r>
               <w:t xml:space="preserve"> </w:t>
             </w:r>
-            <w:r>
-              <w:rPr>
-                <w:rFonts w:ascii="Courier New" w:hAnsi="Courier New" w:cs="Courier New"/>
-              </w:rPr>
-              <w:t>=(</w:t>
-            </w:r>
-            <w:proofErr w:type="spellStart"/>
+          </w:p>
+          <w:p>
+            <w:pPr>
+              <w:rPr>
+                <w:rFonts w:cstheme="minorHAnsi"/>
+              </w:rPr>
+            </w:pPr>
+            <w:r>
+              <w:t xml:space="preserve">In der </w:t>
+            </w:r>
+            <w:r>
+              <w:t>Methode</w:t>
+            </w:r>
+            <w:r>
+              <w:t xml:space="preserve"> </w:t>
+            </w:r>
+            <w:r>
+              <w:rPr>
+                <w:rFonts w:ascii="Courier New" w:hAnsi="Courier New" w:cs="Courier New"/>
+              </w:rPr>
+              <w:t>__</w:t>
+            </w:r>
+            <w:proofErr w:type="spellStart"/>
+            <w:r>
+              <w:rPr>
+                <w:rFonts w:ascii="Courier New" w:hAnsi="Courier New" w:cs="Courier New"/>
+              </w:rPr>
+              <w:t>init</w:t>
+            </w:r>
+            <w:proofErr w:type="spellEnd"/>
+            <w:r>
+              <w:rPr>
+                <w:rFonts w:ascii="Courier New" w:hAnsi="Courier New" w:cs="Courier New"/>
+              </w:rPr>
+              <w:t>_</w:t>
+            </w:r>
             <w:proofErr w:type="gramStart"/>
             <w:r>
               <w:rPr>
                 <w:rFonts w:ascii="Courier New" w:hAnsi="Courier New" w:cs="Courier New"/>
               </w:rPr>
-              <w:t>random.randint</w:t>
-            </w:r>
-            <w:proofErr w:type="spellEnd"/>
+              <w:t>_(</w:t>
+            </w:r>
             <w:proofErr w:type="gramEnd"/>
             <w:r>
               <w:rPr>
                 <w:rFonts w:ascii="Courier New" w:hAnsi="Courier New" w:cs="Courier New"/>
               </w:rPr>
+              <w:t>)</w:t>
+            </w:r>
+            <w:r>
+              <w:rPr>
+                <w:rFonts w:cstheme="minorHAnsi"/>
+              </w:rPr>
+              <w:t xml:space="preserve"> </w:t>
+            </w:r>
+            <w:r>
+              <w:rPr>
+                <w:rFonts w:cstheme="minorHAnsi"/>
+              </w:rPr>
+              <w:t xml:space="preserve">der Spieler-Klasse </w:t>
+            </w:r>
+            <w:r>
+              <w:rPr>
+                <w:rFonts w:cstheme="minorHAnsi"/>
+              </w:rPr>
+              <w:t>w</w:t>
+            </w:r>
+            <w:r>
+              <w:rPr>
+                <w:rFonts w:cstheme="minorHAnsi"/>
+              </w:rPr>
+              <w:t xml:space="preserve">erden neue Eigenschaften </w:t>
+            </w:r>
+            <w:r>
+              <w:rPr>
+                <w:rFonts w:cstheme="minorHAnsi"/>
+              </w:rPr>
+              <w:t xml:space="preserve">definiert: </w:t>
+            </w:r>
+          </w:p>
+          <w:p>
+            <w:pPr>
+              <w:rPr>
+                <w:rFonts w:ascii="Courier New" w:hAnsi="Courier New" w:cs="Courier New"/>
+              </w:rPr>
+            </w:pPr>
+            <w:proofErr w:type="spellStart"/>
+            <w:proofErr w:type="gramStart"/>
+            <w:r>
+              <w:rPr>
+                <w:rFonts w:ascii="Courier New" w:hAnsi="Courier New" w:cs="Courier New"/>
+              </w:rPr>
+              <w:t>self.direction</w:t>
+            </w:r>
+            <w:proofErr w:type="spellEnd"/>
+            <w:proofErr w:type="gramEnd"/>
+            <w:r>
+              <w:rPr>
+                <w:rFonts w:ascii="Courier New" w:hAnsi="Courier New" w:cs="Courier New"/>
+              </w:rPr>
+              <w:t xml:space="preserve"> = </w:t>
+            </w:r>
+            <w:r>
+              <w:rPr>
+                <w:rFonts w:ascii="Courier New" w:hAnsi="Courier New" w:cs="Courier New"/>
+                <w:color w:val="538135" w:themeColor="accent6" w:themeShade="BF"/>
+              </w:rPr>
+              <w:t>"</w:t>
+            </w:r>
+            <w:proofErr w:type="spellStart"/>
+            <w:r>
+              <w:rPr>
+                <w:rFonts w:ascii="Courier New" w:hAnsi="Courier New" w:cs="Courier New"/>
+                <w:color w:val="538135" w:themeColor="accent6" w:themeShade="BF"/>
+              </w:rPr>
+              <w:t>right</w:t>
+            </w:r>
+            <w:proofErr w:type="spellEnd"/>
+            <w:r>
+              <w:rPr>
+                <w:rFonts w:ascii="Courier New" w:hAnsi="Courier New" w:cs="Courier New"/>
+                <w:color w:val="538135" w:themeColor="accent6" w:themeShade="BF"/>
+              </w:rPr>
+              <w:t>"</w:t>
+            </w:r>
+          </w:p>
+          <w:p>
+            <w:pPr>
+              <w:rPr>
+                <w:rFonts w:ascii="Courier New" w:hAnsi="Courier New" w:cs="Courier New"/>
+              </w:rPr>
+            </w:pPr>
+            <w:proofErr w:type="spellStart"/>
+            <w:proofErr w:type="gramStart"/>
+            <w:r>
+              <w:rPr>
+                <w:rFonts w:ascii="Courier New" w:hAnsi="Courier New" w:cs="Courier New"/>
+              </w:rPr>
+              <w:t>self.</w:t>
+            </w:r>
+            <w:r>
+              <w:rPr>
+                <w:rFonts w:ascii="Courier New" w:hAnsi="Courier New" w:cs="Courier New"/>
+              </w:rPr>
+              <w:t>score</w:t>
+            </w:r>
+            <w:proofErr w:type="spellEnd"/>
+            <w:proofErr w:type="gramEnd"/>
+            <w:r>
+              <w:rPr>
+                <w:rFonts w:ascii="Courier New" w:hAnsi="Courier New" w:cs="Courier New"/>
+              </w:rPr>
+              <w:t xml:space="preserve"> = </w:t>
+            </w:r>
+            <w:r>
+              <w:rPr>
+                <w:rFonts w:ascii="Courier New" w:hAnsi="Courier New" w:cs="Courier New"/>
+              </w:rPr>
+              <w:t>0</w:t>
+            </w:r>
+          </w:p>
+          <w:p>
+            <w:pPr>
+              <w:rPr>
+                <w:rFonts w:ascii="Courier New" w:hAnsi="Courier New" w:cs="Courier New"/>
+              </w:rPr>
+            </w:pPr>
+            <w:r>
+              <w:t xml:space="preserve">In der Methode </w:t>
+            </w:r>
+            <w:proofErr w:type="spellStart"/>
+            <w:proofErr w:type="gramStart"/>
+            <w:r>
+              <w:rPr>
+                <w:rFonts w:ascii="Courier New" w:hAnsi="Courier New" w:cs="Courier New"/>
+              </w:rPr>
+              <w:t>move</w:t>
+            </w:r>
+            <w:proofErr w:type="spellEnd"/>
+            <w:r>
+              <w:rPr>
+                <w:rFonts w:ascii="Courier New" w:hAnsi="Courier New" w:cs="Courier New"/>
+              </w:rPr>
               <w:t>(</w:t>
             </w:r>
-            <w:proofErr w:type="gramStart"/>
-            <w:r>
-              <w:rPr>
-                <w:rFonts w:ascii="Courier New" w:hAnsi="Courier New" w:cs="Courier New"/>
-              </w:rPr>
-              <w:t>40,SCREEN</w:t>
-            </w:r>
             <w:proofErr w:type="gramEnd"/>
             <w:r>
               <w:rPr>
                 <w:rFonts w:ascii="Courier New" w:hAnsi="Courier New" w:cs="Courier New"/>
               </w:rPr>
-              <w:t>_WIDTH-40),0)</w:t>
-            </w:r>
-            <w:r>
-              <w:rPr>
-                <w:rFonts w:ascii="Courier New" w:hAnsi="Courier New" w:cs="Courier New"/>
-              </w:rPr>
+              <w:t>)</w:t>
+            </w:r>
+            <w:r>
+              <w:t xml:space="preserve"> der Spieler-Klasse werden zwei neue Bedingungen geprüft:</w:t>
+            </w:r>
+            <w:r>
               <w:br/>
             </w:r>
             <w:r>
-              <w:t xml:space="preserve">durch: </w:t>
-            </w:r>
-          </w:p>
-          <w:p>
-            <w:proofErr w:type="spellStart"/>
-            <w:proofErr w:type="gramStart"/>
-            <w:r>
-              <w:rPr>
-                <w:rFonts w:ascii="Courier New" w:hAnsi="Courier New" w:cs="Courier New"/>
-              </w:rPr>
-              <w:t>self.rect</w:t>
-            </w:r>
-            <w:proofErr w:type="gramEnd"/>
-            <w:r>
-              <w:rPr>
-                <w:rFonts w:ascii="Courier New" w:hAnsi="Courier New" w:cs="Courier New"/>
-              </w:rPr>
-              <w:t>.center</w:t>
-            </w:r>
-            <w:proofErr w:type="spellEnd"/>
-            <w:r>
-              <w:rPr>
-                <w:rFonts w:ascii="Courier New" w:hAnsi="Courier New" w:cs="Courier New"/>
-              </w:rPr>
-              <w:t>=(</w:t>
-            </w:r>
-            <w:proofErr w:type="spellStart"/>
-            <w:proofErr w:type="gramStart"/>
-            <w:r>
-              <w:rPr>
-                <w:rFonts w:ascii="Courier New" w:hAnsi="Courier New" w:cs="Courier New"/>
-              </w:rPr>
-              <w:t>random.randint</w:t>
-            </w:r>
-            <w:proofErr w:type="spellEnd"/>
-            <w:proofErr w:type="gramEnd"/>
-            <w:r>
-              <w:rPr>
-                <w:rFonts w:ascii="Courier New" w:hAnsi="Courier New" w:cs="Courier New"/>
-              </w:rPr>
-              <w:t>(</w:t>
-            </w:r>
-            <w:proofErr w:type="gramStart"/>
-            <w:r>
-              <w:rPr>
-                <w:rFonts w:ascii="Courier New" w:hAnsi="Courier New" w:cs="Courier New"/>
-              </w:rPr>
-              <w:t>15</w:t>
-            </w:r>
-            <w:r>
-              <w:rPr>
-                <w:rFonts w:ascii="Courier New" w:hAnsi="Courier New" w:cs="Courier New"/>
-              </w:rPr>
-              <w:t>0,SCREEN</w:t>
-            </w:r>
-            <w:proofErr w:type="gramEnd"/>
-            <w:r>
-              <w:rPr>
-                <w:rFonts w:ascii="Courier New" w:hAnsi="Courier New" w:cs="Courier New"/>
-              </w:rPr>
-              <w:t>_WIDTH-</w:t>
-            </w:r>
-            <w:r>
-              <w:rPr>
-                <w:rFonts w:ascii="Courier New" w:hAnsi="Courier New" w:cs="Courier New"/>
-              </w:rPr>
-              <w:t>15</w:t>
-            </w:r>
-            <w:r>
-              <w:rPr>
-                <w:rFonts w:ascii="Courier New" w:hAnsi="Courier New" w:cs="Courier New"/>
-              </w:rPr>
-              <w:t>0),0)</w:t>
-            </w:r>
-          </w:p>
-        </w:tc>
-        <w:tc>
-          <w:tcPr>
-            <w:tcW w:w="1746" w:type="dxa"/>
-          </w:tcPr>
-          <w:p/>
-        </w:tc>
-      </w:tr>
-      <w:tr>
-        <w:tc>
-          <w:tcPr>
-            <w:tcW w:w="479" w:type="dxa"/>
-          </w:tcPr>
-          <w:p>
-            <w:r>
-              <w:t>4</w:t>
-            </w:r>
-          </w:p>
-        </w:tc>
-        <w:tc>
-          <w:tcPr>
-            <w:tcW w:w="8231" w:type="dxa"/>
-          </w:tcPr>
-          <w:p>
-            <w:r>
-              <w:t>D</w:t>
-            </w:r>
-            <w:r>
-              <w:t xml:space="preserve">ie Berechnung des Scores wird von der Gegner-Klasse in die Spieler-Klasse verschoben. </w:t>
-            </w:r>
-          </w:p>
-          <w:p>
-            <w:pPr>
-              <w:rPr>
-                <w:rFonts w:cstheme="minorHAnsi"/>
-              </w:rPr>
-            </w:pPr>
-            <w:r>
-              <w:t xml:space="preserve">In der </w:t>
-            </w:r>
-            <w:r>
-              <w:t>Methode</w:t>
-            </w:r>
-            <w:r>
-              <w:t xml:space="preserve"> </w:t>
-            </w:r>
-            <w:r>
-              <w:rPr>
-                <w:rFonts w:ascii="Courier New" w:hAnsi="Courier New" w:cs="Courier New"/>
-              </w:rPr>
-              <w:t>__</w:t>
-            </w:r>
-            <w:proofErr w:type="spellStart"/>
-            <w:r>
-              <w:rPr>
-                <w:rFonts w:ascii="Courier New" w:hAnsi="Courier New" w:cs="Courier New"/>
-              </w:rPr>
-              <w:t>init</w:t>
-            </w:r>
-            <w:proofErr w:type="spellEnd"/>
-            <w:r>
-              <w:rPr>
-                <w:rFonts w:ascii="Courier New" w:hAnsi="Courier New" w:cs="Courier New"/>
-              </w:rPr>
-              <w:t>_</w:t>
-            </w:r>
-            <w:proofErr w:type="gramStart"/>
-            <w:r>
-              <w:rPr>
-                <w:rFonts w:ascii="Courier New" w:hAnsi="Courier New" w:cs="Courier New"/>
-              </w:rPr>
-              <w:t>_(</w:t>
-            </w:r>
-            <w:proofErr w:type="gramEnd"/>
-            <w:r>
-              <w:rPr>
-                <w:rFonts w:ascii="Courier New" w:hAnsi="Courier New" w:cs="Courier New"/>
-              </w:rPr>
-              <w:t>)</w:t>
-            </w:r>
-            <w:r>
-              <w:rPr>
-                <w:rFonts w:cstheme="minorHAnsi"/>
-              </w:rPr>
-              <w:t xml:space="preserve"> wird</w:t>
-            </w:r>
-            <w:r>
-              <w:rPr>
-                <w:rFonts w:cstheme="minorHAnsi"/>
-              </w:rPr>
-              <w:t xml:space="preserve"> die Anfangsrichtung definiert: </w:t>
-            </w:r>
-          </w:p>
-          <w:p>
-            <w:pPr>
-              <w:rPr>
-                <w:rFonts w:ascii="Courier New" w:hAnsi="Courier New" w:cs="Courier New"/>
-              </w:rPr>
-            </w:pPr>
-            <w:proofErr w:type="spellStart"/>
-            <w:proofErr w:type="gramStart"/>
-            <w:r>
-              <w:rPr>
-                <w:rFonts w:ascii="Courier New" w:hAnsi="Courier New" w:cs="Courier New"/>
-              </w:rPr>
-              <w:t>self.direction</w:t>
-            </w:r>
-            <w:proofErr w:type="spellEnd"/>
-            <w:proofErr w:type="gramEnd"/>
-            <w:r>
-              <w:rPr>
-                <w:rFonts w:ascii="Courier New" w:hAnsi="Courier New" w:cs="Courier New"/>
-              </w:rPr>
-              <w:t xml:space="preserve"> = </w:t>
-            </w:r>
-            <w:r>
-              <w:rPr>
-                <w:rFonts w:ascii="Courier New" w:hAnsi="Courier New" w:cs="Courier New"/>
-                <w:color w:val="538135" w:themeColor="accent6" w:themeShade="BF"/>
-              </w:rPr>
-              <w:t>"</w:t>
-            </w:r>
-            <w:proofErr w:type="spellStart"/>
-            <w:r>
-              <w:rPr>
-                <w:rFonts w:ascii="Courier New" w:hAnsi="Courier New" w:cs="Courier New"/>
-                <w:color w:val="538135" w:themeColor="accent6" w:themeShade="BF"/>
-              </w:rPr>
-              <w:t>right</w:t>
-            </w:r>
-            <w:proofErr w:type="spellEnd"/>
-            <w:r>
-              <w:rPr>
-                <w:rFonts w:ascii="Courier New" w:hAnsi="Courier New" w:cs="Courier New"/>
-                <w:color w:val="538135" w:themeColor="accent6" w:themeShade="BF"/>
-              </w:rPr>
-              <w:t>"</w:t>
-            </w:r>
-          </w:p>
-          <w:p>
-            <w:r>
-              <w:t xml:space="preserve">Die </w:t>
-            </w:r>
-            <w:r>
-              <w:t>Methode</w:t>
-            </w:r>
-            <w:r>
-              <w:t xml:space="preserve"> </w:t>
-            </w:r>
-            <w:proofErr w:type="spellStart"/>
-            <w:r>
-              <w:rPr>
-                <w:rFonts w:ascii="Courier New" w:hAnsi="Courier New" w:cs="Courier New"/>
-              </w:rPr>
-              <w:t>draw_</w:t>
-            </w:r>
-            <w:proofErr w:type="gramStart"/>
-            <w:r>
-              <w:rPr>
-                <w:rFonts w:ascii="Courier New" w:hAnsi="Courier New" w:cs="Courier New"/>
-              </w:rPr>
-              <w:t>score</w:t>
-            </w:r>
-            <w:proofErr w:type="spellEnd"/>
-            <w:r>
-              <w:rPr>
-                <w:rFonts w:ascii="Courier New" w:hAnsi="Courier New" w:cs="Courier New"/>
-              </w:rPr>
-              <w:t>(</w:t>
-            </w:r>
-            <w:proofErr w:type="gramEnd"/>
-            <w:r>
-              <w:rPr>
-                <w:rFonts w:ascii="Courier New" w:hAnsi="Courier New" w:cs="Courier New"/>
-              </w:rPr>
-              <w:t>)</w:t>
-            </w:r>
-            <w:r>
-              <w:t xml:space="preserve"> wird von der Gegner-Klasse in die Spieler-Klasse verschoben.</w:t>
-            </w:r>
-          </w:p>
-          <w:p>
-            <w:r>
-              <w:t xml:space="preserve">In der </w:t>
-            </w:r>
-            <w:r>
-              <w:t>Methode</w:t>
-            </w:r>
-            <w:r>
-              <w:t xml:space="preserve"> </w:t>
-            </w:r>
-            <w:proofErr w:type="spellStart"/>
-            <w:proofErr w:type="gramStart"/>
-            <w:r>
-              <w:rPr>
-                <w:rFonts w:ascii="Courier New" w:hAnsi="Courier New" w:cs="Courier New"/>
-              </w:rPr>
-              <w:t>move</w:t>
-            </w:r>
-            <w:proofErr w:type="spellEnd"/>
-            <w:r>
-              <w:rPr>
-                <w:rFonts w:ascii="Courier New" w:hAnsi="Courier New" w:cs="Courier New"/>
-              </w:rPr>
-              <w:t>(</w:t>
-            </w:r>
-            <w:proofErr w:type="gramEnd"/>
-            <w:r>
-              <w:rPr>
-                <w:rFonts w:ascii="Courier New" w:hAnsi="Courier New" w:cs="Courier New"/>
-              </w:rPr>
-              <w:t>)</w:t>
-            </w:r>
-            <w:r>
-              <w:t xml:space="preserve"> der Spieler-Klasse</w:t>
-            </w:r>
-            <w:r>
-              <w:t xml:space="preserve"> werden zwei neue Bedingungen geprüft</w:t>
-            </w:r>
-            <w:r>
-              <w:t>:</w:t>
-            </w:r>
-            <w:r>
-              <w:br/>
-            </w:r>
-            <w:r>
               <w:rPr>
                 <w:noProof/>
               </w:rPr>
               <w:drawing>
-                <wp:inline distT="0" distB="0" distL="0" distR="0" wp14:anchorId="41E36812" wp14:editId="1BD5FEAE">
+                <wp:inline distT="0" distB="0" distL="0" distR="0" wp14:anchorId="2E356322" wp14:editId="5128ECF0">
                   <wp:extent cx="5089585" cy="920457"/>
                   <wp:effectExtent l="0" t="0" r="0" b="0"/>
                   <wp:docPr id="1831452124" name="Grafik 1"/>
@@ -34476,7 +34481,7 @@
                           <pic:cNvPicPr/>
                         </pic:nvPicPr>
                         <pic:blipFill>
-                          <a:blip r:embed="rId54"/>
+                          <a:blip r:embed="rId53"/>
                           <a:stretch>
                             <a:fillRect/>
                           </a:stretch>
@@ -34505,75 +34510,116 @@
               <w:t xml:space="preserve"> </w:t>
             </w:r>
             <w:r>
-              <w:t>Methode</w:t>
+              <w:t xml:space="preserve">Variable </w:t>
+            </w:r>
+            <w:proofErr w:type="spellStart"/>
+            <w:r>
+              <w:rPr>
+                <w:rFonts w:ascii="Courier New" w:hAnsi="Courier New" w:cs="Courier New"/>
+              </w:rPr>
+              <w:t>my</w:t>
+            </w:r>
+            <w:r>
+              <w:rPr>
+                <w:rFonts w:ascii="Courier New" w:hAnsi="Courier New" w:cs="Courier New"/>
+              </w:rPr>
+              <w:t>_</w:t>
+            </w:r>
+            <w:proofErr w:type="gramStart"/>
+            <w:r>
+              <w:rPr>
+                <w:rFonts w:ascii="Courier New" w:hAnsi="Courier New" w:cs="Courier New"/>
+              </w:rPr>
+              <w:t>score</w:t>
+            </w:r>
+            <w:proofErr w:type="spellEnd"/>
+            <w:r>
+              <w:rPr>
+                <w:rFonts w:ascii="Courier New" w:hAnsi="Courier New" w:cs="Courier New"/>
+              </w:rPr>
+              <w:t>(</w:t>
+            </w:r>
+            <w:proofErr w:type="gramEnd"/>
+            <w:r>
+              <w:rPr>
+                <w:rFonts w:ascii="Courier New" w:hAnsi="Courier New" w:cs="Courier New"/>
+              </w:rPr>
+              <w:t>)</w:t>
             </w:r>
             <w:r>
               <w:t xml:space="preserve"> </w:t>
             </w:r>
-            <w:proofErr w:type="spellStart"/>
-            <w:r>
-              <w:rPr>
-                <w:rFonts w:ascii="Courier New" w:hAnsi="Courier New" w:cs="Courier New"/>
-              </w:rPr>
-              <w:t>draw_</w:t>
+            <w:r>
+              <w:t xml:space="preserve">wird </w:t>
+            </w:r>
+            <w:r>
+              <w:t xml:space="preserve">aus </w:t>
+            </w:r>
+            <w:r>
+              <w:rPr>
+                <w:rFonts w:ascii="Courier New" w:hAnsi="Courier New" w:cs="Courier New"/>
+              </w:rPr>
+              <w:t>P1.score</w:t>
+            </w:r>
+            <w:r>
+              <w:t xml:space="preserve"> berechnet:</w:t>
+            </w:r>
+          </w:p>
+          <w:p>
+            <w:pPr>
+              <w:rPr>
+                <w:rFonts w:ascii="Courier New" w:hAnsi="Courier New" w:cs="Courier New"/>
+              </w:rPr>
+            </w:pPr>
+            <w:proofErr w:type="spellStart"/>
+            <w:r>
+              <w:rPr>
+                <w:rFonts w:ascii="Courier New" w:hAnsi="Courier New" w:cs="Courier New"/>
+              </w:rPr>
+              <w:t>my_score</w:t>
+            </w:r>
+            <w:proofErr w:type="spellEnd"/>
+            <w:r>
+              <w:rPr>
+                <w:rFonts w:ascii="Courier New" w:hAnsi="Courier New" w:cs="Courier New"/>
+              </w:rPr>
+              <w:t xml:space="preserve"> = </w:t>
+            </w:r>
+            <w:proofErr w:type="spellStart"/>
+            <w:r>
+              <w:rPr>
+                <w:rFonts w:ascii="Courier New" w:hAnsi="Courier New" w:cs="Courier New"/>
+              </w:rPr>
+              <w:t>font_</w:t>
             </w:r>
             <w:proofErr w:type="gramStart"/>
             <w:r>
               <w:rPr>
                 <w:rFonts w:ascii="Courier New" w:hAnsi="Courier New" w:cs="Courier New"/>
               </w:rPr>
-              <w:t>score</w:t>
-            </w:r>
-            <w:proofErr w:type="spellEnd"/>
+              <w:t>small.render</w:t>
+            </w:r>
+            <w:proofErr w:type="spellEnd"/>
+            <w:proofErr w:type="gramEnd"/>
             <w:r>
               <w:rPr>
                 <w:rFonts w:ascii="Courier New" w:hAnsi="Courier New" w:cs="Courier New"/>
               </w:rPr>
               <w:t>(</w:t>
             </w:r>
-            <w:proofErr w:type="gramEnd"/>
-            <w:r>
-              <w:rPr>
-                <w:rFonts w:ascii="Courier New" w:hAnsi="Courier New" w:cs="Courier New"/>
-              </w:rPr>
-              <w:t>)</w:t>
-            </w:r>
-            <w:r>
-              <w:t xml:space="preserve"> </w:t>
-            </w:r>
-            <w:r>
-              <w:t xml:space="preserve">wird </w:t>
-            </w:r>
-            <w:r>
-              <w:t xml:space="preserve">als Methode der </w:t>
-            </w:r>
-            <w:r>
-              <w:t>Spieler-</w:t>
-            </w:r>
-            <w:r>
-              <w:t>Instanz</w:t>
-            </w:r>
-            <w:r>
-              <w:t xml:space="preserve"> aufgerufen:</w:t>
-            </w:r>
-          </w:p>
-          <w:p>
-            <w:pPr>
-              <w:rPr>
-                <w:rFonts w:ascii="Courier New" w:hAnsi="Courier New" w:cs="Courier New"/>
-              </w:rPr>
-            </w:pPr>
-            <w:r>
-              <w:rPr>
-                <w:rFonts w:ascii="Courier New" w:hAnsi="Courier New" w:cs="Courier New"/>
-              </w:rPr>
-              <w:t>P</w:t>
-            </w:r>
-            <w:r>
-              <w:rPr>
-                <w:rFonts w:ascii="Courier New" w:hAnsi="Courier New" w:cs="Courier New"/>
-              </w:rPr>
-              <w:t>1.draw_score(screen)</w:t>
+            <w:proofErr w:type="spellStart"/>
+            <w:r>
+              <w:rPr>
+                <w:rFonts w:ascii="Courier New" w:hAnsi="Courier New" w:cs="Courier New"/>
+              </w:rPr>
+              <w:t>str</w:t>
+            </w:r>
+            <w:proofErr w:type="spellEnd"/>
+            <w:r>
+              <w:rPr>
+                <w:rFonts w:ascii="Courier New" w:hAnsi="Courier New" w:cs="Courier New"/>
+              </w:rPr>
+              <w:t>(P1.score), True, BLACK)</w:t>
             </w:r>
           </w:p>
         </w:tc>
@@ -34603,7 +34649,7 @@
     <w:p>
       <w:pPr>
         <w:sectPr>
-          <w:headerReference w:type="default" r:id="rId55"/>
+          <w:headerReference w:type="default" r:id="rId54"/>
           <w:pgSz w:w="11906" w:h="16838"/>
           <w:pgMar w:top="720" w:right="720" w:bottom="720" w:left="720" w:header="708" w:footer="708" w:gutter="0"/>
           <w:cols w:space="708"/>
@@ -34615,12 +34661,12 @@
       <w:pPr>
         <w:pStyle w:val="berschrift1"/>
       </w:pPr>
-      <w:bookmarkStart w:id="129" w:name="_Toc213070221"/>
+      <w:bookmarkStart w:id="132" w:name="_Toc220769246"/>
       <w:r>
         <w:lastRenderedPageBreak/>
         <w:t>Quellen</w:t>
       </w:r>
-      <w:bookmarkEnd w:id="129"/>
+      <w:bookmarkEnd w:id="132"/>
     </w:p>
     <w:tbl>
       <w:tblPr>
@@ -34681,7 +34727,7 @@
             <w:tcW w:w="5240" w:type="dxa"/>
           </w:tcPr>
           <w:p>
-            <w:hyperlink r:id="rId56" w:history="1">
+            <w:hyperlink r:id="rId55" w:history="1">
               <w:r>
                 <w:rPr>
                   <w:rStyle w:val="Hyperlink"/>
@@ -34708,7 +34754,7 @@
             <w:tcW w:w="5240" w:type="dxa"/>
           </w:tcPr>
           <w:p>
-            <w:hyperlink r:id="rId57" w:history="1">
+            <w:hyperlink r:id="rId56" w:history="1">
               <w:r>
                 <w:rPr>
                   <w:rStyle w:val="Hyperlink"/>
@@ -34799,7 +34845,7 @@
             <w:tcW w:w="5240" w:type="dxa"/>
           </w:tcPr>
           <w:p>
-            <w:hyperlink r:id="rId58" w:history="1">
+            <w:hyperlink r:id="rId57" w:history="1">
               <w:r>
                 <w:rPr>
                   <w:rStyle w:val="Hyperlink"/>
@@ -34826,7 +34872,7 @@
             <w:tcW w:w="5240" w:type="dxa"/>
           </w:tcPr>
           <w:p>
-            <w:hyperlink r:id="rId59" w:history="1">
+            <w:hyperlink r:id="rId58" w:history="1">
               <w:r>
                 <w:rPr>
                   <w:rStyle w:val="Hyperlink"/>
@@ -34858,7 +34904,7 @@
             <w:tcW w:w="5240" w:type="dxa"/>
           </w:tcPr>
           <w:p>
-            <w:hyperlink r:id="rId60" w:history="1">
+            <w:hyperlink r:id="rId59" w:history="1">
               <w:r>
                 <w:rPr>
                   <w:rStyle w:val="Hyperlink"/>
@@ -34885,7 +34931,7 @@
             <w:tcW w:w="5240" w:type="dxa"/>
           </w:tcPr>
           <w:p>
-            <w:hyperlink r:id="rId61" w:history="1">
+            <w:hyperlink r:id="rId60" w:history="1">
               <w:r>
                 <w:rPr>
                   <w:rStyle w:val="Hyperlink"/>
@@ -34912,7 +34958,7 @@
             <w:tcW w:w="5240" w:type="dxa"/>
           </w:tcPr>
           <w:p>
-            <w:hyperlink r:id="rId62" w:history="1">
+            <w:hyperlink r:id="rId61" w:history="1">
               <w:r>
                 <w:rPr>
                   <w:rStyle w:val="Hyperlink"/>
@@ -34939,7 +34985,7 @@
             <w:tcW w:w="5240" w:type="dxa"/>
           </w:tcPr>
           <w:p>
-            <w:hyperlink r:id="rId63" w:history="1">
+            <w:hyperlink r:id="rId62" w:history="1">
               <w:r>
                 <w:rPr>
                   <w:rStyle w:val="Hyperlink"/>
@@ -34966,7 +35012,7 @@
             <w:tcW w:w="5240" w:type="dxa"/>
           </w:tcPr>
           <w:p>
-            <w:hyperlink r:id="rId64" w:history="1">
+            <w:hyperlink r:id="rId63" w:history="1">
               <w:r>
                 <w:rPr>
                   <w:rStyle w:val="Hyperlink"/>
@@ -34998,7 +35044,7 @@
             <w:tcW w:w="5240" w:type="dxa"/>
           </w:tcPr>
           <w:p>
-            <w:hyperlink r:id="rId65" w:history="1">
+            <w:hyperlink r:id="rId64" w:history="1">
               <w:r>
                 <w:rPr>
                   <w:rStyle w:val="Hyperlink"/>
@@ -35025,7 +35071,7 @@
     </w:tbl>
     <w:p/>
     <w:sectPr>
-      <w:headerReference w:type="default" r:id="rId66"/>
+      <w:headerReference w:type="default" r:id="rId65"/>
       <w:pgSz w:w="11906" w:h="16838"/>
       <w:pgMar w:top="720" w:right="720" w:bottom="720" w:left="720" w:header="708" w:footer="708" w:gutter="0"/>
       <w:cols w:space="708"/>
@@ -35162,7 +35208,7 @@
       <w:rPr>
         <w:noProof/>
       </w:rPr>
-      <w:t>29.01.2026</w:t>
+      <w:t>31.01.2026</w:t>
     </w:r>
     <w:r>
       <w:rPr>

</xml_diff>